<commit_message>
v3: Compact final draft with X1 review integration and anticipated findings
Key changes:
- X1 Research Guardian feedback: counterbalanced task design, QUAN reframed
  as descriptive/exploratory, independent coder for qualitative reliability,
  passive/active audit trail data separated
- Anticipated Findings section: predicted results per RQ, four design tensions
- Claude Code CLI constraint addressed with mitigation strategies
- Theoretical framework: inference chain clarified as design rationale
- Compact: targeted ≤15 pages APA double-spaced
- Stronger narrative flow: vignette → problem → lessons → framework → method → predictions

Co-Authored-By: Claude Opus 4.6 (1M context) <noreply@anthropic.com>
</commit_message>
<xml_diff>
--- a/You_Yang_2026_Research_Design_Draft.docx
+++ b/You_Yang_2026_Research_Design_Draft.docx
@@ -106,7 +106,7 @@
           <w:i w:val="0"/>
           <w:sz w:val="24"/>
         </w:rPr>
-        <w:t xml:space="preserve">Correspondence concerning this article should be addressed to Hosung You, College of Education, Pennsylvania State University. </w:t>
+        <w:t>Correspondence concerning this article should be addressed to Hosung You, College of Education, Pennsylvania State University.</w:t>
       </w:r>
     </w:p>
     <w:p>
@@ -137,7 +137,7 @@
           <w:i w:val="0"/>
           <w:sz w:val="24"/>
         </w:rPr>
-        <w:t>AI-powered research tools are rapidly being adopted by graduate students for research design, yet mode collapse and automation bias threaten to homogenize and supplant researchers’ methodological reasoning. This study proposes a two-phase research design examining whether multi-agent AI tools can scaffold—rather than replace—researchers’ thinking. Integrating authentic learning theory (Herrington et al., 2010), Verbalized Sampling methodology, and the Model Context Protocol (MCP) architecture, we investigate Diverga, a 44-agent AI research methodology assistant with structured human checkpoints. Drawing on lessons from authentic learning design failures (Yang &amp; Harbor, 2023), Phase 1 employs an LXD-informed design case with systematic learner and contextual analysis. Phase 2 uses a convergent mixed-methods evaluation with doctoral students (N = 12–16) at two institutions. This study contributes an authentic AI scaffolding framework, evidence-based design principles, and a learner-centered evaluation methodology for AI-mediated research tools.</w:t>
+        <w:t>AI-powered research tools are rapidly adopted by graduate students, yet mode collapse and automation bias threaten to homogenize researchers’ methodological reasoning. This study proposes a two-phase design examining whether multi-agent AI tools can scaffold—rather than replace—such reasoning. Integrating authentic learning theory (Herrington et al., 2010), Verbalized Sampling methodology, and Model Context Protocol architecture, we investigate Diverga, a 44-agent AI research assistant with structured human checkpoints. Drawing on lessons from authentic learning design failures (Yang &amp; Harbor, 2023), Phase 1 employs an LXD-informed design case with systematic learner and contextual analysis. Phase 2 uses a counterbalanced mixed-methods evaluation with doctoral students (N = 12–16) at two institutions. We anticipate that system-enforced authentic learning elements (forced reflection, multiple perspectives) will manifest strongly, while elements requiring voluntary engagement (collaboration, articulation) will be weaker—revealing conditions under which AI scaffolding succeeds or fails.</w:t>
       </w:r>
     </w:p>
     <w:p>
@@ -194,7 +194,7 @@
           <w:i w:val="0"/>
           <w:sz w:val="24"/>
         </w:rPr>
-        <w:t>It is spring 2026, and Jiwon, a third-year doctoral student in educational psychology, opens her laptop to design her dissertation study on how AI tutoring systems affect student motivation in K-12 settings. She prompts ChatGPT for a theoretical framework. Within seconds, the Technology Acceptance Model appears. She tries different phrasings; TAM returns each time. She switches to Claude and receives Self-Determination Theory—more appropriate, but still the field’s most frequently cited option. Across three AI tools, Jiwon encounters variations of the same two or three recommendations that dominate the published literature. She begins to wonder: Am I choosing a framework because it fits my research question, or because the AI keeps suggesting it?</w:t>
+        <w:t>It is spring 2026. Jiwon, a third-year doctoral student in educational psychology, prompts ChatGPT for a theoretical framework to study AI tutoring and K-12 motivation. The Technology Acceptance Model appears. She tries different phrasings; TAM returns each time. She switches to Claude: Self-Determination Theory—closer, but still the most frequently cited option. Across three AI tools, Jiwon encounters variations of the same two or three recommendations. She begins to wonder: Am I choosing a framework because it fits my research, or because the AI keeps suggesting it?</w:t>
       </w:r>
     </w:p>
     <w:p>
@@ -208,7 +208,7 @@
           <w:i w:val="0"/>
           <w:sz w:val="24"/>
         </w:rPr>
-        <w:t>Down the hall, a fellow doctoral student runs a similar query through Diverga, a multi-agent AI research assistant. Instead of a single answer, Diverga presents five theoretical alternatives, each accompanied by a typicality score indicating how “modal” the recommendation is relative to the training data. At a required human checkpoint, the system pauses and prompts: “Before proceeding, consider how this framework aligns with your epistemological position and research context.” The student stops, reflects, and makes a deliberate, justified choice.</w:t>
+        <w:t>Down the hall, a fellow student runs a similar query through Diverga, a multi-agent AI research assistant. Instead of a single answer, Diverga presents five theoretical alternatives with typicality scores indicating how “modal” each recommendation is. At a required checkpoint, the system pauses: “Before proceeding, consider how this framework aligns with your epistemological position.” The student stops, reflects, and makes a deliberate choice.</w:t>
       </w:r>
     </w:p>
     <w:p>
@@ -222,13 +222,12 @@
           <w:i w:val="0"/>
           <w:sz w:val="24"/>
         </w:rPr>
-        <w:t>These two scenarios—one in which AI narrows the researcher’s horizon, another in which it deliberately expands it—represent the central tension this study investigates. As AI research tools become ubiquitous in graduate education, a fundamental design question emerges: Can these tools be built to scaffold researchers’ methodological reasoning rather than replace it?</w:t>
+        <w:t>These scenarios represent the central tension this study investigates. As AI research tools become ubiquitous in graduate education, can they be designed to scaffold researchers’ methodological reasoning rather than replace it?</w:t>
       </w:r>
     </w:p>
     <w:p>
       <w:pPr>
         <w:spacing w:before="240"/>
-        <w:jc w:val="left"/>
       </w:pPr>
       <w:r>
         <w:rPr>
@@ -251,42 +250,12 @@
           <w:i w:val="0"/>
           <w:sz w:val="24"/>
         </w:rPr>
-        <w:t>The rapid adoption of AI-powered research tools—Elicit, Consensus, SciSpace, and general-purpose large language models—has introduced two structural problems into the research design process. The first is mode collapse: when AI tools converge on predictable, modal recommendations that reflect the typicality bias embedded in training data (arXiv:2510.01171). The second is automation bias: the well-documented tendency for users to accept AI-generated suggestions without critical evaluation. A systematic review reported that the majority of agents accepted AI output without independent review, and AI tool usage frequency has been found to correlate negatively with critical thinking ability, mediated by cognitive offloading (Microsoft Research, 2025). Together, these problems threaten to homogenize the methodological landscape of social science research.</w:t>
+        <w:t>Two structural problems characterize current AI research tools. Mode collapse occurs when AI converges on predictable, modal recommendations reflecting typicality bias in training data (arXiv:2510.01171). Automation bias—the tendency to accept AI suggestions without critical evaluation—compounds this problem. AI tool usage has been found to correlate negatively with critical thinking, mediated by cognitive offloading (Microsoft Research, 2025). Together, these problems risk homogenizing the methodological landscape of social science research at precisely the moment when AI tools are being most rapidly adopted.</w:t>
       </w:r>
     </w:p>
     <w:p>
       <w:pPr>
         <w:spacing w:before="240"/>
-        <w:jc w:val="left"/>
-      </w:pPr>
-      <w:r>
-        <w:rPr>
-          <w:rFonts w:ascii="Times New Roman" w:hAnsi="Times New Roman"/>
-          <w:b/>
-          <w:i w:val="0"/>
-          <w:sz w:val="24"/>
-        </w:rPr>
-        <w:t>The Gap: Missing Design Frameworks</w:t>
-      </w:r>
-    </w:p>
-    <w:p>
-      <w:pPr>
-        <w:ind w:firstLine="720"/>
-      </w:pPr>
-      <w:r>
-        <w:rPr>
-          <w:rFonts w:ascii="Times New Roman" w:hAnsi="Times New Roman"/>
-          <w:b w:val="0"/>
-          <w:i w:val="0"/>
-          <w:sz w:val="24"/>
-        </w:rPr>
-        <w:t>Despite growing awareness of these risks, the field lacks empirically grounded design frameworks specifying how AI research tools should be constructed to support—rather than supplant—researchers’ critical thinking. Existing ethical frameworks for AI in education address learners and educators but not researchers using AI for study design (EDUCAUSE, 2025). This gap calls for research that examines concrete design features—such as multi-agent architectures, human checkpoints, and diversity-generating mechanisms—through established pedagogical theory.</w:t>
-      </w:r>
-    </w:p>
-    <w:p>
-      <w:pPr>
-        <w:spacing w:before="240"/>
-        <w:jc w:val="left"/>
       </w:pPr>
       <w:r>
         <w:rPr>
@@ -309,7 +278,7 @@
           <w:i w:val="0"/>
           <w:sz w:val="24"/>
         </w:rPr>
-        <w:t>A critical insight motivating this study comes from Yang and Harbor’s (2023) design case analysis of failures in an authentic learning program. Their study documented seven categories of design failure—from engagement difficulties to varied transfer of learning—and traced them to a common root cause: the absence of systematic upfront learner analysis and contextual analysis. When the program expanded from a homogeneous group to diverse participants without redesigning its foundations, the authentic learning principles that had guided the original design no longer aligned with learners’ actual needs, backgrounds, and contexts.</w:t>
+        <w:t>A critical insight motivating this study comes from Yang and Harbor’s (2023) design case of failures in an authentic learning program. Their analysis documented seven categories of failure—from engagement difficulties to varied transfer—and traced them to a common root: the absence of systematic upfront learner and contextual analysis. When the program expanded to diverse participants without understanding their backgrounds, motivations, and contexts, the authentic learning principles no longer aligned with actual needs.</w:t>
       </w:r>
     </w:p>
     <w:p>
@@ -323,13 +292,12 @@
           <w:i w:val="0"/>
           <w:sz w:val="24"/>
         </w:rPr>
-        <w:t>This finding carries direct implications for AI research tool design. If authentic learning fails without understanding the learner and context, then designing an AI scaffolding system without analyzing who will use it and under what conditions is likely to produce similar failures. The present study therefore integrates learner and contextual analysis as a foundational phase, applying lessons from instructional design to the emerging domain of AI-mediated research methodology assistance.</w:t>
+        <w:t>This finding carries direct implications for AI tool design. If authentic learning fails without understanding the learner and context, designing an AI scaffolding system without analyzing who uses it and under what conditions will likely produce similar failures. The present study therefore integrates learner and contextual analysis as a foundational phase.</w:t>
       </w:r>
     </w:p>
     <w:p>
       <w:pPr>
         <w:spacing w:before="240"/>
-        <w:jc w:val="left"/>
       </w:pPr>
       <w:r>
         <w:rPr>
@@ -352,7 +320,7 @@
           <w:i w:val="0"/>
           <w:sz w:val="24"/>
         </w:rPr>
-        <w:t>This study brings together two complementary lines of research. The first, grounded in authentic learning theory and instructional design, provides the pedagogical framework for understanding what makes learning environments effective and why they sometimes fail (Herrington et al., 2010; Yang &amp; Harbor, 2023). The second, grounded in computational approaches to AI diversity, provides the technical mechanisms for counteracting mode collapse through Verbalized Sampling and multi-agent orchestration via the Model Context Protocol (Yang et al., 2025). The convergence of these two perspectives creates a unique opportunity to examine AI research tool design through a theoretically grounded, learner-centered lens.</w:t>
+        <w:t>This study brings together authentic learning theory and instructional design expertise (Yang) with Verbalized Sampling methodology and multi-agent AI architecture (You). Both investigators share a technical foundation in the Model Context Protocol—Yang from a pedagogical perspective (dynamic learner state; Yang et al., 2025), You from a tool design perspective (Diverga’s 44-agent architecture). This convergence enables examining AI research tool design through a theoretically grounded, learner-centered lens while addressing the developer-researcher dual role limitation acknowledged in the existing Diverga evaluation proposal.</w:t>
       </w:r>
     </w:p>
     <w:p>
@@ -381,7 +349,7 @@
           <w:i w:val="0"/>
           <w:sz w:val="24"/>
         </w:rPr>
-        <w:t>The theoretical architecture of this study integrates three components: authentic learning as the pedagogical design and analysis framework, Verbalized Sampling as the diversity-generation mechanism, and the Model Context Protocol as the technical infrastructure for multi-agent orchestration. Figure 1 presents the integrated conceptual framework.</w:t>
+        <w:t>The framework integrates three components connected by a directional inference chain (see Figure 1). Authentic learning theory specifies what design elements promote deep engagement and transfer. Verbalized Sampling provides the mechanism predicted by authentic learning’s “multiple perspectives” element to counter mode collapse. The Model Context Protocol provides the technical architecture that enables multi-agent orchestration of both mechanisms. This chain—from pedagogical design principles, through diversity-generation mechanism, to technical implementation—forms a design rationale rather than a unified theory, each layer informing the next.</w:t>
       </w:r>
     </w:p>
     <w:p>
@@ -391,7 +359,7 @@
       <w:r>
         <w:drawing>
           <wp:inline xmlns:a="http://schemas.openxmlformats.org/drawingml/2006/main" xmlns:pic="http://schemas.openxmlformats.org/drawingml/2006/picture">
-            <wp:extent cx="5486400" cy="6574971"/>
+            <wp:extent cx="5303520" cy="6421358"/>
             <wp:docPr id="1" name="Picture 1"/>
             <wp:cNvGraphicFramePr>
               <a:graphicFrameLocks noChangeAspect="1"/>
@@ -400,7 +368,7 @@
               <a:graphicData uri="http://schemas.openxmlformats.org/drawingml/2006/picture">
                 <pic:pic>
                   <pic:nvPicPr>
-                    <pic:cNvPr id="0" name="figure1_framework.png"/>
+                    <pic:cNvPr id="0" name="fig1.png"/>
                     <pic:cNvPicPr/>
                   </pic:nvPicPr>
                   <pic:blipFill>
@@ -412,7 +380,7 @@
                   <pic:spPr>
                     <a:xfrm>
                       <a:off x="0" y="0"/>
-                      <a:ext cx="5486400" cy="6574971"/>
+                      <a:ext cx="5303520" cy="6421358"/>
                     </a:xfrm>
                     <a:prstGeom prst="rect"/>
                   </pic:spPr>
@@ -439,7 +407,7 @@
     </w:p>
     <w:p>
       <w:pPr>
-        <w:spacing w:after="240"/>
+        <w:spacing w:after="120"/>
       </w:pPr>
       <w:r>
         <w:rPr>
@@ -448,13 +416,12 @@
           <w:i/>
           <w:sz w:val="24"/>
         </w:rPr>
-        <w:t>Conceptual framework for authentic AI scaffolding. The framework integrates three theoretical pillars that, when operationalized through Diverga’s design features, produce three scaffolding mechanisms hypothesized to preserve and enhance researchers’ methodological reasoning.</w:t>
+        <w:t>Conceptual framework for authentic AI scaffolding. Authentic learning theory predicts the effect of multiple perspectives and forced reflection; Verbalized Sampling provides the mechanism; MCP architecture enables multi-agent implementation. The scaffolding effect is conditional on learner and contextual analysis (Yang &amp; Harbor, 2023).</w:t>
       </w:r>
     </w:p>
     <w:p>
       <w:pPr>
         <w:spacing w:before="240"/>
-        <w:jc w:val="left"/>
       </w:pPr>
       <w:r>
         <w:rPr>
@@ -463,7 +430,7 @@
           <w:i w:val="0"/>
           <w:sz w:val="24"/>
         </w:rPr>
-        <w:t>Authentic Learning</w:t>
+        <w:t>Authentic Learning as Design and Analysis Framework</w:t>
       </w:r>
     </w:p>
     <w:p>
@@ -477,21 +444,7 @@
           <w:i w:val="0"/>
           <w:sz w:val="24"/>
         </w:rPr>
-        <w:t>Herrington, Reeves, and Oliver’s (2010) authentic learning framework identifies nine elements that characterize learning environments promoting deep engagement and knowledge transfer: authentic context, authentic activity, multiple perspectives, collaboration, reflection, articulation, coaching and scaffolding, authentic assessment, and expert performance modeling. Originally developed for technology-enhanced learning in higher education, this framework has been applied across diverse instructional contexts but not yet to AI-mediated research tool design.</w:t>
-      </w:r>
-    </w:p>
-    <w:p>
-      <w:pPr>
-        <w:ind w:firstLine="720"/>
-      </w:pPr>
-      <w:r>
-        <w:rPr>
-          <w:rFonts w:ascii="Times New Roman" w:hAnsi="Times New Roman"/>
-          <w:b w:val="0"/>
-          <w:i w:val="0"/>
-          <w:sz w:val="24"/>
-        </w:rPr>
-        <w:t>Critically, Yang and Harbor (2023) demonstrated that authentic learning principles alone are insufficient—they must be grounded in systematic learner and contextual analysis. Their analysis of seven design failures revealed that misalignment between design assumptions and actual learner characteristics (e.g., disciplinary background, motivation, prior experience) led to engagement failures, cultural conflicts, and varied learning transfer. Applying this lesson, we propose that AI research tools must be designed not only with authentic learning principles but with explicit attention to who the researchers are and what contexts they bring.</w:t>
+        <w:t>Herrington et al.’s (2010) nine elements of authentic learning—authentic context, authentic activity, multiple perspectives, collaboration, reflection, articulation, coaching, authentic assessment, and expert performance—serve dual roles: as criteria for designing the Diverga experience and as dimensions for evaluating scaffolding effectiveness. Table 1 maps each element to specific Diverga features.</w:t>
       </w:r>
     </w:p>
     <w:p>
@@ -510,7 +463,7 @@
     </w:p>
     <w:p>
       <w:pPr>
-        <w:spacing w:after="120"/>
+        <w:spacing w:after="80"/>
       </w:pPr>
       <w:r>
         <w:rPr>
@@ -519,7 +472,7 @@
           <w:i/>
           <w:sz w:val="24"/>
         </w:rPr>
-        <w:t>Mapping of Authentic Learning Elements to Diverga Design Features</w:t>
+        <w:t>Authentic Learning Elements Mapped to Diverga Design Features</w:t>
       </w:r>
     </w:p>
     <w:tbl>
@@ -550,7 +503,7 @@
           </w:tcPr>
           <w:p>
             <w:pPr>
-              <w:spacing w:line="360" w:lineRule="auto" w:before="80" w:after="80"/>
+              <w:spacing w:line="360" w:lineRule="auto"/>
             </w:pPr>
             <w:r/>
             <w:r>
@@ -580,7 +533,7 @@
           </w:tcPr>
           <w:p>
             <w:pPr>
-              <w:spacing w:line="360" w:lineRule="auto" w:before="80" w:after="80"/>
+              <w:spacing w:line="360" w:lineRule="auto"/>
             </w:pPr>
             <w:r/>
             <w:r>
@@ -610,7 +563,7 @@
           </w:tcPr>
           <w:p>
             <w:pPr>
-              <w:spacing w:line="360" w:lineRule="auto" w:before="80" w:after="80"/>
+              <w:spacing w:line="360" w:lineRule="auto"/>
             </w:pPr>
             <w:r/>
             <w:r>
@@ -620,7 +573,7 @@
                 <w:i/>
                 <w:sz w:val="20"/>
               </w:rPr>
-              <w:t>Design Rationale</w:t>
+              <w:t>Rationale</w:t>
             </w:r>
           </w:p>
         </w:tc>
@@ -638,7 +591,7 @@
           </w:tcPr>
           <w:p>
             <w:pPr>
-              <w:spacing w:line="360" w:lineRule="auto" w:before="40" w:after="40"/>
+              <w:spacing w:line="360" w:lineRule="auto"/>
             </w:pPr>
             <w:r/>
             <w:r>
@@ -664,7 +617,7 @@
           </w:tcPr>
           <w:p>
             <w:pPr>
-              <w:spacing w:line="360" w:lineRule="auto" w:before="40" w:after="40"/>
+              <w:spacing w:line="360" w:lineRule="auto"/>
             </w:pPr>
             <w:r/>
             <w:r>
@@ -690,7 +643,7 @@
           </w:tcPr>
           <w:p>
             <w:pPr>
-              <w:spacing w:line="360" w:lineRule="auto" w:before="40" w:after="40"/>
+              <w:spacing w:line="360" w:lineRule="auto"/>
             </w:pPr>
             <w:r/>
             <w:r>
@@ -700,7 +653,7 @@
                 <w:i w:val="0"/>
                 <w:sz w:val="20"/>
               </w:rPr>
-              <w:t>Ecological validity; tasks mirror actual workflows</w:t>
+              <w:t>Ecological validity</w:t>
             </w:r>
           </w:p>
         </w:tc>
@@ -718,7 +671,7 @@
           </w:tcPr>
           <w:p>
             <w:pPr>
-              <w:spacing w:line="360" w:lineRule="auto" w:before="40" w:after="40"/>
+              <w:spacing w:line="360" w:lineRule="auto"/>
             </w:pPr>
             <w:r/>
             <w:r>
@@ -744,7 +697,7 @@
           </w:tcPr>
           <w:p>
             <w:pPr>
-              <w:spacing w:line="360" w:lineRule="auto" w:before="40" w:after="40"/>
+              <w:spacing w:line="360" w:lineRule="auto"/>
             </w:pPr>
             <w:r/>
             <w:r>
@@ -770,7 +723,7 @@
           </w:tcPr>
           <w:p>
             <w:pPr>
-              <w:spacing w:line="360" w:lineRule="auto" w:before="40" w:after="40"/>
+              <w:spacing w:line="360" w:lineRule="auto"/>
             </w:pPr>
             <w:r/>
             <w:r>
@@ -780,7 +733,7 @@
                 <w:i w:val="0"/>
                 <w:sz w:val="20"/>
               </w:rPr>
-              <w:t>Matches authentic research design process</w:t>
+              <w:t>Mirrors researcher workflow</w:t>
             </w:r>
           </w:p>
         </w:tc>
@@ -798,7 +751,7 @@
           </w:tcPr>
           <w:p>
             <w:pPr>
-              <w:spacing w:line="360" w:lineRule="auto" w:before="40" w:after="40"/>
+              <w:spacing w:line="360" w:lineRule="auto"/>
             </w:pPr>
             <w:r/>
             <w:r>
@@ -824,7 +777,7 @@
           </w:tcPr>
           <w:p>
             <w:pPr>
-              <w:spacing w:line="360" w:lineRule="auto" w:before="40" w:after="40"/>
+              <w:spacing w:line="360" w:lineRule="auto"/>
             </w:pPr>
             <w:r/>
             <w:r>
@@ -834,7 +787,7 @@
                 <w:i w:val="0"/>
                 <w:sz w:val="20"/>
               </w:rPr>
-              <w:t>VS multi-alternative generation with T-Scores</w:t>
+              <w:t>VS multi-alternative + T-Scores</w:t>
             </w:r>
           </w:p>
         </w:tc>
@@ -850,7 +803,7 @@
           </w:tcPr>
           <w:p>
             <w:pPr>
-              <w:spacing w:line="360" w:lineRule="auto" w:before="40" w:after="40"/>
+              <w:spacing w:line="360" w:lineRule="auto"/>
             </w:pPr>
             <w:r/>
             <w:r>
@@ -860,7 +813,7 @@
                 <w:i w:val="0"/>
                 <w:sz w:val="20"/>
               </w:rPr>
-              <w:t>Counters mode collapse; surfaces non-modal options</w:t>
+              <w:t>Counters mode collapse</w:t>
             </w:r>
           </w:p>
         </w:tc>
@@ -878,7 +831,7 @@
           </w:tcPr>
           <w:p>
             <w:pPr>
-              <w:spacing w:line="360" w:lineRule="auto" w:before="40" w:after="40"/>
+              <w:spacing w:line="360" w:lineRule="auto"/>
             </w:pPr>
             <w:r/>
             <w:r>
@@ -904,7 +857,7 @@
           </w:tcPr>
           <w:p>
             <w:pPr>
-              <w:spacing w:line="360" w:lineRule="auto" w:before="40" w:after="40"/>
+              <w:spacing w:line="360" w:lineRule="auto"/>
             </w:pPr>
             <w:r/>
             <w:r>
@@ -914,7 +867,7 @@
                 <w:i w:val="0"/>
                 <w:sz w:val="20"/>
               </w:rPr>
-              <w:t>Structured AI–researcher dialogue at checkpoints</w:t>
+              <w:t>Structured AI–researcher dialogue</w:t>
             </w:r>
           </w:p>
         </w:tc>
@@ -930,7 +883,7 @@
           </w:tcPr>
           <w:p>
             <w:pPr>
-              <w:spacing w:line="360" w:lineRule="auto" w:before="40" w:after="40"/>
+              <w:spacing w:line="360" w:lineRule="auto"/>
             </w:pPr>
             <w:r/>
             <w:r>
@@ -940,7 +893,7 @@
                 <w:i w:val="0"/>
                 <w:sz w:val="20"/>
               </w:rPr>
-              <w:t>AI as epistemic partner, not oracle</w:t>
+              <w:t>AI as epistemic partner</w:t>
             </w:r>
           </w:p>
         </w:tc>
@@ -958,7 +911,7 @@
           </w:tcPr>
           <w:p>
             <w:pPr>
-              <w:spacing w:line="360" w:lineRule="auto" w:before="40" w:after="40"/>
+              <w:spacing w:line="360" w:lineRule="auto"/>
             </w:pPr>
             <w:r/>
             <w:r>
@@ -984,7 +937,7 @@
           </w:tcPr>
           <w:p>
             <w:pPr>
-              <w:spacing w:line="360" w:lineRule="auto" w:before="40" w:after="40"/>
+              <w:spacing w:line="360" w:lineRule="auto"/>
             </w:pPr>
             <w:r/>
             <w:r>
@@ -994,7 +947,7 @@
                 <w:i w:val="0"/>
                 <w:sz w:val="20"/>
               </w:rPr>
-              <w:t>REQUIRED human checkpoints (forced pause)</w:t>
+              <w:t>REQUIRED human checkpoints</w:t>
             </w:r>
           </w:p>
         </w:tc>
@@ -1010,7 +963,7 @@
           </w:tcPr>
           <w:p>
             <w:pPr>
-              <w:spacing w:line="360" w:lineRule="auto" w:before="40" w:after="40"/>
+              <w:spacing w:line="360" w:lineRule="auto"/>
             </w:pPr>
             <w:r/>
             <w:r>
@@ -1020,7 +973,7 @@
                 <w:i w:val="0"/>
                 <w:sz w:val="20"/>
               </w:rPr>
-              <w:t>Cognitive forcing function (Buçinca et al., 2021)</w:t>
+              <w:t>Cognitive forcing function</w:t>
             </w:r>
           </w:p>
         </w:tc>
@@ -1038,7 +991,7 @@
           </w:tcPr>
           <w:p>
             <w:pPr>
-              <w:spacing w:line="360" w:lineRule="auto" w:before="40" w:after="40"/>
+              <w:spacing w:line="360" w:lineRule="auto"/>
             </w:pPr>
             <w:r/>
             <w:r>
@@ -1064,7 +1017,7 @@
           </w:tcPr>
           <w:p>
             <w:pPr>
-              <w:spacing w:line="360" w:lineRule="auto" w:before="40" w:after="40"/>
+              <w:spacing w:line="360" w:lineRule="auto"/>
             </w:pPr>
             <w:r/>
             <w:r>
@@ -1074,7 +1027,7 @@
                 <w:i w:val="0"/>
                 <w:sz w:val="20"/>
               </w:rPr>
-              <w:t>Decision audit trail (YAML log)</w:t>
+              <w:t>Decision audit trail</w:t>
             </w:r>
           </w:p>
         </w:tc>
@@ -1090,7 +1043,7 @@
           </w:tcPr>
           <w:p>
             <w:pPr>
-              <w:spacing w:line="360" w:lineRule="auto" w:before="40" w:after="40"/>
+              <w:spacing w:line="360" w:lineRule="auto"/>
             </w:pPr>
             <w:r/>
             <w:r>
@@ -1100,7 +1053,7 @@
                 <w:i w:val="0"/>
                 <w:sz w:val="20"/>
               </w:rPr>
-              <w:t>Externalizes reasoning; supports metacognition</w:t>
+              <w:t>Externalizes reasoning</w:t>
             </w:r>
           </w:p>
         </w:tc>
@@ -1118,7 +1071,7 @@
           </w:tcPr>
           <w:p>
             <w:pPr>
-              <w:spacing w:line="360" w:lineRule="auto" w:before="40" w:after="40"/>
+              <w:spacing w:line="360" w:lineRule="auto"/>
             </w:pPr>
             <w:r/>
             <w:r>
@@ -1144,7 +1097,7 @@
           </w:tcPr>
           <w:p>
             <w:pPr>
-              <w:spacing w:line="360" w:lineRule="auto" w:before="40" w:after="40"/>
+              <w:spacing w:line="360" w:lineRule="auto"/>
             </w:pPr>
             <w:r/>
             <w:r>
@@ -1154,7 +1107,7 @@
                 <w:i w:val="0"/>
                 <w:sz w:val="20"/>
               </w:rPr>
-              <w:t>Agent-specific guidance with T-Score explanation</w:t>
+              <w:t>Agent guidance + T-Score explanation</w:t>
             </w:r>
           </w:p>
         </w:tc>
@@ -1170,7 +1123,7 @@
           </w:tcPr>
           <w:p>
             <w:pPr>
-              <w:spacing w:line="360" w:lineRule="auto" w:before="40" w:after="40"/>
+              <w:spacing w:line="360" w:lineRule="auto"/>
             </w:pPr>
             <w:r/>
             <w:r>
@@ -1180,7 +1133,7 @@
                 <w:i w:val="0"/>
                 <w:sz w:val="20"/>
               </w:rPr>
-              <w:t>Calibrated, transparent support</w:t>
+              <w:t>Calibrated support</w:t>
             </w:r>
           </w:p>
         </w:tc>
@@ -1198,7 +1151,7 @@
           </w:tcPr>
           <w:p>
             <w:pPr>
-              <w:spacing w:line="360" w:lineRule="auto" w:before="40" w:after="40"/>
+              <w:spacing w:line="360" w:lineRule="auto"/>
             </w:pPr>
             <w:r/>
             <w:r>
@@ -1224,7 +1177,7 @@
           </w:tcPr>
           <w:p>
             <w:pPr>
-              <w:spacing w:line="360" w:lineRule="auto" w:before="40" w:after="40"/>
+              <w:spacing w:line="360" w:lineRule="auto"/>
             </w:pPr>
             <w:r/>
             <w:r>
@@ -1250,7 +1203,7 @@
           </w:tcPr>
           <w:p>
             <w:pPr>
-              <w:spacing w:line="360" w:lineRule="auto" w:before="40" w:after="40"/>
+              <w:spacing w:line="360" w:lineRule="auto"/>
             </w:pPr>
             <w:r/>
             <w:r>
@@ -1260,7 +1213,7 @@
                 <w:i w:val="0"/>
                 <w:sz w:val="20"/>
               </w:rPr>
-              <w:t>Performance-based evaluation</w:t>
+              <w:t>Performance-based</w:t>
             </w:r>
           </w:p>
         </w:tc>
@@ -1281,7 +1234,7 @@
           </w:tcPr>
           <w:p>
             <w:pPr>
-              <w:spacing w:line="360" w:lineRule="auto" w:before="40" w:after="40"/>
+              <w:spacing w:line="360" w:lineRule="auto"/>
             </w:pPr>
             <w:r/>
             <w:r>
@@ -1310,7 +1263,7 @@
           </w:tcPr>
           <w:p>
             <w:pPr>
-              <w:spacing w:line="360" w:lineRule="auto" w:before="40" w:after="40"/>
+              <w:spacing w:line="360" w:lineRule="auto"/>
             </w:pPr>
             <w:r/>
             <w:r>
@@ -1320,7 +1273,7 @@
                 <w:i w:val="0"/>
                 <w:sz w:val="20"/>
               </w:rPr>
-              <w:t>44 domain-specialized agents across 9 categories</w:t>
+              <w:t>44 domain-specialized agents</w:t>
             </w:r>
           </w:p>
         </w:tc>
@@ -1339,7 +1292,7 @@
           </w:tcPr>
           <w:p>
             <w:pPr>
-              <w:spacing w:line="360" w:lineRule="auto" w:before="40" w:after="40"/>
+              <w:spacing w:line="360" w:lineRule="auto"/>
             </w:pPr>
             <w:r/>
             <w:r>
@@ -1349,7 +1302,7 @@
                 <w:i w:val="0"/>
                 <w:sz w:val="20"/>
               </w:rPr>
-              <w:t>Models expert reasoning per methodological domain</w:t>
+              <w:t>Models expert reasoning</w:t>
             </w:r>
           </w:p>
         </w:tc>
@@ -1372,14 +1325,13 @@
           <w:rFonts w:ascii="Times New Roman" w:hAnsi="Times New Roman"/>
           <w:sz w:val="20"/>
         </w:rPr>
-        <w:t>AL = authentic learning; VS = Verbalized Sampling; RQ = research question; T-Score = typicality score indicating how modal a recommendation is.</w:t>
+        <w:t>VS = Verbalized Sampling; T-Score = typicality score.</w:t>
       </w:r>
     </w:p>
     <w:p/>
     <w:p>
       <w:pPr>
         <w:spacing w:before="240"/>
-        <w:jc w:val="left"/>
       </w:pPr>
       <w:r>
         <w:rPr>
@@ -1388,7 +1340,7 @@
           <w:i w:val="0"/>
           <w:sz w:val="24"/>
         </w:rPr>
-        <w:t>Verbalized Sampling and Mode Collapse Theory</w:t>
+        <w:t>Verbalized Sampling, MCP Architecture, and Core Conjecture</w:t>
       </w:r>
     </w:p>
     <w:p>
@@ -1402,65 +1354,7 @@
           <w:i w:val="0"/>
           <w:sz w:val="24"/>
         </w:rPr>
-        <w:t>Verbalized Sampling (VS; arXiv:2510.01171) is a prompting methodology designed to mitigate mode collapse by instructing language models to generate multiple alternative outputs with explicit typicality scores. The T-Score quantifies how modal each recommendation is relative to the training distribution, enabling users to distinguish between conventional and unconventional options. In Diverga, VS is integrated at every checkpoint where methodological recommendations are presented, ensuring that researchers encounter a range of alternatives rather than a single default answer. This mechanism directly operationalizes the authentic learning element of multiple perspectives.</w:t>
-      </w:r>
-    </w:p>
-    <w:p>
-      <w:pPr>
-        <w:spacing w:before="240"/>
-        <w:jc w:val="left"/>
-      </w:pPr>
-      <w:r>
-        <w:rPr>
-          <w:rFonts w:ascii="Times New Roman" w:hAnsi="Times New Roman"/>
-          <w:b/>
-          <w:i w:val="0"/>
-          <w:sz w:val="24"/>
-        </w:rPr>
-        <w:t>Model Context Protocol Architecture</w:t>
-      </w:r>
-    </w:p>
-    <w:p>
-      <w:pPr>
-        <w:ind w:firstLine="720"/>
-      </w:pPr>
-      <w:r>
-        <w:rPr>
-          <w:rFonts w:ascii="Times New Roman" w:hAnsi="Times New Roman"/>
-          <w:b w:val="0"/>
-          <w:i w:val="0"/>
-          <w:sz w:val="24"/>
-        </w:rPr>
-        <w:t>The Model Context Protocol (MCP) provides the technical infrastructure for orchestrating multiple specialized AI agents within a unified system. Yang et al. (2025) theorized how MCP enables dynamic learner state management by coordinating AI agents that adapt to evolving performance contexts. Diverga implements 44 specialized agents across nine research categories, each possessing domain-specific methodological expertise and coordinated through MCP. This shared technical foundation between Yang’s theoretical framework and Diverga’s implementation creates a unique opportunity to examine how architectural decisions in multi-agent systems shape the scaffolding experience.</w:t>
-      </w:r>
-    </w:p>
-    <w:p>
-      <w:pPr>
-        <w:spacing w:before="240"/>
-        <w:jc w:val="left"/>
-      </w:pPr>
-      <w:r>
-        <w:rPr>
-          <w:rFonts w:ascii="Times New Roman" w:hAnsi="Times New Roman"/>
-          <w:b/>
-          <w:i w:val="0"/>
-          <w:sz w:val="24"/>
-        </w:rPr>
-        <w:t>Core Conjecture</w:t>
-      </w:r>
-    </w:p>
-    <w:p>
-      <w:pPr>
-        <w:ind w:firstLine="720"/>
-      </w:pPr>
-      <w:r>
-        <w:rPr>
-          <w:rFonts w:ascii="Times New Roman" w:hAnsi="Times New Roman"/>
-          <w:b w:val="0"/>
-          <w:i w:val="0"/>
-          <w:sz w:val="24"/>
-        </w:rPr>
-        <w:t>Drawing these threads together, the core conjecture of this study is as follows: When an AI research tool implements authentic learning principles through multi-agent architecture with structured human checkpoints and diversity-generating mechanisms, it scaffolds—rather than replaces—researchers’ methodological reasoning. This scaffolding effect is hypothesized to operate through three mechanisms: forced reflection (checkpoints that interrupt automated acceptance), perspective expansion (VS alternatives that broaden the option space), and reasoning externalization (audit trails that make decision rationale visible and revisitable). Crucially, following Yang and Harbor’s (2023) lesson, this conjecture holds only when the tool design is informed by systematic learner and contextual analysis.</w:t>
+        <w:t>Verbalized Sampling (arXiv:2510.01171) mitigates mode collapse by generating multiple alternatives with typicality scores, directly operationalizing the “multiple perspectives” element. The Model Context Protocol (Yang et al., 2025) orchestrates 44 specialized agents, enabling domain-specific scaffolding. The core conjecture is: When these mechanisms are implemented through structured human checkpoints, they scaffold researchers’ reasoning through forced reflection, perspective expansion, and reasoning externalization—conditional on systematic learner and contextual analysis.</w:t>
       </w:r>
     </w:p>
     <w:p>
@@ -1478,18 +1372,6 @@
         <w:t>Research Questions</w:t>
       </w:r>
     </w:p>
-    <w:p>
-      <w:r>
-        <w:rPr>
-          <w:rFonts w:ascii="Times New Roman" w:hAnsi="Times New Roman"/>
-          <w:b w:val="0"/>
-          <w:i w:val="0"/>
-          <w:sz w:val="24"/>
-        </w:rPr>
-        <w:t>This study is guided by three research questions:</w:t>
-      </w:r>
-    </w:p>
-    <w:p/>
     <w:p>
       <w:pPr>
         <w:ind w:firstLine="720"/>
@@ -1510,7 +1392,7 @@
           <w:i w:val="0"/>
           <w:sz w:val="24"/>
         </w:rPr>
-        <w:t>How do the authentic learning elements embedded in Diverga’s checkpoint system manifest in researchers’ actual usage patterns and experiences?</w:t>
+        <w:t>How do the authentic learning elements embedded in Diverga’s checkpoint system manifest in researchers’ actual usage?</w:t>
       </w:r>
     </w:p>
     <w:p>
@@ -1556,7 +1438,7 @@
           <w:i w:val="0"/>
           <w:sz w:val="24"/>
         </w:rPr>
-        <w:t>What design tensions emerge between authentic scaffolding goals and actual user interactions in a multi-agent AI research tool, and how do learner and contextual factors mediate these tensions?</w:t>
+        <w:t>What design tensions emerge between scaffolding goals and actual user interactions, and how do learner and contextual factors mediate these tensions?</w:t>
       </w:r>
     </w:p>
     <w:p>
@@ -1577,7 +1459,6 @@
     <w:p>
       <w:pPr>
         <w:spacing w:before="240"/>
-        <w:jc w:val="left"/>
       </w:pPr>
       <w:r>
         <w:rPr>
@@ -1600,7 +1481,7 @@
           <w:i w:val="0"/>
           <w:sz w:val="24"/>
         </w:rPr>
-        <w:t>This study employs a two-phase design that combines a design case methodology with a convergent mixed-methods evaluation (see Figure 2). Phase 1 documents the design rationale of Diverga’s checkpoint system through an LXD-informed design case enriched by systematic learner and contextual analysis—a direct application of Yang and Harbor’s (2023) recommendation that authentic learning designs must be grounded in understanding the learner population and context before implementation. Phase 2 empirically examines how the design performs with actual users through quantitative behavioral data and qualitative experiential data, modeled on Yang et al.’s (2025) mixed-methods approach to studying AI tool interactions.</w:t>
+        <w:t>This study employs a two-phase design (see Figure 2). Phase 1 documents Diverga’s checkpoint system through an LXD-informed design case with systematic learner and contextual analysis—applying Yang and Harbor’s (2023) recommendation that authentic learning designs must be grounded in learner understanding. Phase 2 conducts a counterbalanced mixed-methods evaluation with doctoral students at two institutions.</w:t>
       </w:r>
     </w:p>
     <w:p>
@@ -1610,7 +1491,7 @@
       <w:r>
         <w:drawing>
           <wp:inline xmlns:a="http://schemas.openxmlformats.org/drawingml/2006/main" xmlns:pic="http://schemas.openxmlformats.org/drawingml/2006/picture">
-            <wp:extent cx="5486400" cy="4034971"/>
+            <wp:extent cx="5303520" cy="3813069"/>
             <wp:docPr id="2" name="Picture 2"/>
             <wp:cNvGraphicFramePr>
               <a:graphicFrameLocks noChangeAspect="1"/>
@@ -1619,7 +1500,7 @@
               <a:graphicData uri="http://schemas.openxmlformats.org/drawingml/2006/picture">
                 <pic:pic>
                   <pic:nvPicPr>
-                    <pic:cNvPr id="0" name="figure2_design.png"/>
+                    <pic:cNvPr id="0" name="fig2.png"/>
                     <pic:cNvPicPr/>
                   </pic:nvPicPr>
                   <pic:blipFill>
@@ -1631,7 +1512,7 @@
                   <pic:spPr>
                     <a:xfrm>
                       <a:off x="0" y="0"/>
-                      <a:ext cx="5486400" cy="4034971"/>
+                      <a:ext cx="5303520" cy="3813069"/>
                     </a:xfrm>
                     <a:prstGeom prst="rect"/>
                   </pic:spPr>
@@ -1658,7 +1539,7 @@
     </w:p>
     <w:p>
       <w:pPr>
-        <w:spacing w:after="240"/>
+        <w:spacing w:after="120"/>
       </w:pPr>
       <w:r>
         <w:rPr>
@@ -1667,13 +1548,12 @@
           <w:i/>
           <w:sz w:val="24"/>
         </w:rPr>
-        <w:t>Two-phase research design overview. Phase 1 (design case with learner and contextual analysis) informs Phase 2 (mixed-methods evaluation). Findings converge to produce theoretical, practical, and methodological contributions.</w:t>
+        <w:t>Two-phase research design. Phase 1 informs Phase 2 through design principles and learner personas. Phase 2 uses counterbalanced task order to control for sequence effects.</w:t>
       </w:r>
     </w:p>
     <w:p>
       <w:pPr>
         <w:spacing w:before="240"/>
-        <w:jc w:val="left"/>
       </w:pPr>
       <w:r>
         <w:rPr>
@@ -1682,7 +1562,7 @@
           <w:i w:val="0"/>
           <w:sz w:val="24"/>
         </w:rPr>
-        <w:t>Phase 1: LXD-Informed Design Case With Learner and Contextual Analysis</w:t>
+        <w:t>Phase 1: Design Case With Learner and Contextual Analysis</w:t>
       </w:r>
     </w:p>
     <w:p>
@@ -1696,65 +1576,7 @@
           <w:i w:val="0"/>
           <w:sz w:val="24"/>
         </w:rPr>
-        <w:t>Phase 1 serves a dual purpose: documenting the design decisions behind Diverga’s checkpoint architecture and establishing a learner-centered foundation for Phase 2. The design case methodology (Boling, 2010; Smith, 2010) provides the structure for the former, while the learner and contextual analysis framework addresses the latter.</w:t>
-      </w:r>
-    </w:p>
-    <w:p>
-      <w:pPr>
-        <w:spacing w:before="240"/>
-        <w:jc w:val="left"/>
-      </w:pPr>
-      <w:r>
-        <w:rPr>
-          <w:rFonts w:ascii="Times New Roman" w:hAnsi="Times New Roman"/>
-          <w:b/>
-          <w:i/>
-          <w:sz w:val="24"/>
-        </w:rPr>
-        <w:t>Design Documentation</w:t>
-      </w:r>
-    </w:p>
-    <w:p>
-      <w:pPr>
-        <w:ind w:firstLine="720"/>
-      </w:pPr>
-      <w:r>
-        <w:rPr>
-          <w:rFonts w:ascii="Times New Roman" w:hAnsi="Times New Roman"/>
-          <w:b w:val="0"/>
-          <w:i w:val="0"/>
-          <w:sz w:val="24"/>
-        </w:rPr>
-        <w:t>Using Learning Experience Design (LXD) methods, this phase systematically maps each of the nine authentic learning elements to specific Diverga design features (see Table 1), documents the design decisions and alternatives considered at each stage, analyzes how the MCP architecture enables or constrains each authentic learning element, and subjects the mapping to review by two to three independent instructional design experts.</w:t>
-      </w:r>
-    </w:p>
-    <w:p>
-      <w:pPr>
-        <w:spacing w:before="240"/>
-        <w:jc w:val="left"/>
-      </w:pPr>
-      <w:r>
-        <w:rPr>
-          <w:rFonts w:ascii="Times New Roman" w:hAnsi="Times New Roman"/>
-          <w:b/>
-          <w:i/>
-          <w:sz w:val="24"/>
-        </w:rPr>
-        <w:t>Learner and Contextual Analysis</w:t>
-      </w:r>
-    </w:p>
-    <w:p>
-      <w:pPr>
-        <w:ind w:firstLine="720"/>
-      </w:pPr>
-      <w:r>
-        <w:rPr>
-          <w:rFonts w:ascii="Times New Roman" w:hAnsi="Times New Roman"/>
-          <w:b w:val="0"/>
-          <w:i w:val="0"/>
-          <w:sz w:val="24"/>
-        </w:rPr>
-        <w:t>Yang and Harbor’s (2023) analysis demonstrated that authentic learning designs fail when they proceed without systematic understanding of their learner population. Adapting Tessmer and Richey’s (1997) three-context framework for the present study, we conduct learner and contextual analyses across three levels that inform both the task design and the analytic lens for Phase 2. Table 2 presents this framework.</w:t>
+        <w:t>Phase 1 documents design decisions using LXD methods (Boling, 2010; Smith, 2010) and maps each authentic learning element to Diverga features, with expert review by two to three independent instructional design researchers (non-authors). Simultaneously, adapting Tessmer and Richey’s (1997) three-context model, we conduct learner and contextual analyses across orienting (pre-interaction), instructional (during), and transfer (post-interaction) contexts (see Table 2).</w:t>
       </w:r>
     </w:p>
     <w:p>
@@ -1773,7 +1595,7 @@
     </w:p>
     <w:p>
       <w:pPr>
-        <w:spacing w:after="120"/>
+        <w:spacing w:after="80"/>
       </w:pPr>
       <w:r>
         <w:rPr>
@@ -1782,7 +1604,7 @@
           <w:i/>
           <w:sz w:val="24"/>
         </w:rPr>
-        <w:t>Learner and Contextual Analysis Framework Adapted for AI-Mediated Research Design</w:t>
+        <w:t>Learner and Contextual Analysis Framework</w:t>
       </w:r>
     </w:p>
     <w:tbl>
@@ -1813,7 +1635,7 @@
           </w:tcPr>
           <w:p>
             <w:pPr>
-              <w:spacing w:line="360" w:lineRule="auto" w:before="80" w:after="80"/>
+              <w:spacing w:line="360" w:lineRule="auto"/>
             </w:pPr>
             <w:r/>
             <w:r>
@@ -1823,7 +1645,7 @@
                 <w:i/>
                 <w:sz w:val="20"/>
               </w:rPr>
-              <w:t>Context Level</w:t>
+              <w:t>Context</w:t>
             </w:r>
           </w:p>
         </w:tc>
@@ -1843,7 +1665,7 @@
           </w:tcPr>
           <w:p>
             <w:pPr>
-              <w:spacing w:line="360" w:lineRule="auto" w:before="80" w:after="80"/>
+              <w:spacing w:line="360" w:lineRule="auto"/>
             </w:pPr>
             <w:r/>
             <w:r>
@@ -1853,7 +1675,7 @@
                 <w:i/>
                 <w:sz w:val="20"/>
               </w:rPr>
-              <w:t>Analysis Focus</w:t>
+              <w:t>Focus</w:t>
             </w:r>
           </w:p>
         </w:tc>
@@ -1873,7 +1695,7 @@
           </w:tcPr>
           <w:p>
             <w:pPr>
-              <w:spacing w:line="360" w:lineRule="auto" w:before="80" w:after="80"/>
+              <w:spacing w:line="360" w:lineRule="auto"/>
             </w:pPr>
             <w:r/>
             <w:r>
@@ -1883,7 +1705,7 @@
                 <w:i/>
                 <w:sz w:val="20"/>
               </w:rPr>
-              <w:t>Data Sources</w:t>
+              <w:t>Sources</w:t>
             </w:r>
           </w:p>
         </w:tc>
@@ -1901,7 +1723,7 @@
           </w:tcPr>
           <w:p>
             <w:pPr>
-              <w:spacing w:line="360" w:lineRule="auto" w:before="40" w:after="40"/>
+              <w:spacing w:line="360" w:lineRule="auto"/>
             </w:pPr>
             <w:r/>
             <w:r>
@@ -1911,7 +1733,7 @@
                 <w:i w:val="0"/>
                 <w:sz w:val="20"/>
               </w:rPr>
-              <w:t>Orienting context</w:t>
+              <w:t>Orienting</w:t>
               <w:br/>
               <w:t>(pre-interaction)</w:t>
             </w:r>
@@ -1929,7 +1751,7 @@
           </w:tcPr>
           <w:p>
             <w:pPr>
-              <w:spacing w:line="360" w:lineRule="auto" w:before="40" w:after="40"/>
+              <w:spacing w:line="360" w:lineRule="auto"/>
             </w:pPr>
             <w:r/>
             <w:r>
@@ -1939,7 +1761,7 @@
                 <w:i w:val="0"/>
                 <w:sz w:val="20"/>
               </w:rPr>
-              <w:t>Prior research methods training; AI tool experience and attitudes; disciplinary norms; epistemological orientation</w:t>
+              <w:t>Methods training; AI experience; epistemological orientation; disciplinary norms</w:t>
             </w:r>
           </w:p>
         </w:tc>
@@ -1955,7 +1777,7 @@
           </w:tcPr>
           <w:p>
             <w:pPr>
-              <w:spacing w:line="360" w:lineRule="auto" w:before="40" w:after="40"/>
+              <w:spacing w:line="360" w:lineRule="auto"/>
             </w:pPr>
             <w:r/>
             <w:r>
@@ -1983,7 +1805,7 @@
           </w:tcPr>
           <w:p>
             <w:pPr>
-              <w:spacing w:line="360" w:lineRule="auto" w:before="40" w:after="40"/>
+              <w:spacing w:line="360" w:lineRule="auto"/>
             </w:pPr>
             <w:r/>
             <w:r>
@@ -1993,7 +1815,7 @@
                 <w:i w:val="0"/>
                 <w:sz w:val="20"/>
               </w:rPr>
-              <w:t>Instructional context</w:t>
+              <w:t>Instructional</w:t>
               <w:br/>
               <w:t>(during interaction)</w:t>
             </w:r>
@@ -2011,7 +1833,7 @@
           </w:tcPr>
           <w:p>
             <w:pPr>
-              <w:spacing w:line="360" w:lineRule="auto" w:before="40" w:after="40"/>
+              <w:spacing w:line="360" w:lineRule="auto"/>
             </w:pPr>
             <w:r/>
             <w:r>
@@ -2021,7 +1843,7 @@
                 <w:i w:val="0"/>
                 <w:sz w:val="20"/>
               </w:rPr>
-              <w:t>Diverga interaction patterns; checkpoint engagement quality; T-Score interpretation accuracy; agent navigation behavior</w:t>
+              <w:t>Checkpoint engagement quality; T-Score interpretation; navigation behavior</w:t>
             </w:r>
           </w:p>
         </w:tc>
@@ -2037,7 +1859,7 @@
           </w:tcPr>
           <w:p>
             <w:pPr>
-              <w:spacing w:line="360" w:lineRule="auto" w:before="40" w:after="40"/>
+              <w:spacing w:line="360" w:lineRule="auto"/>
             </w:pPr>
             <w:r/>
             <w:r>
@@ -2068,7 +1890,7 @@
           </w:tcPr>
           <w:p>
             <w:pPr>
-              <w:spacing w:line="360" w:lineRule="auto" w:before="40" w:after="40"/>
+              <w:spacing w:line="360" w:lineRule="auto"/>
             </w:pPr>
             <w:r/>
             <w:r>
@@ -2078,7 +1900,7 @@
                 <w:i w:val="0"/>
                 <w:sz w:val="20"/>
               </w:rPr>
-              <w:t>Transfer context</w:t>
+              <w:t>Transfer</w:t>
               <w:br/>
               <w:t>(post-interaction)</w:t>
             </w:r>
@@ -2099,7 +1921,7 @@
           </w:tcPr>
           <w:p>
             <w:pPr>
-              <w:spacing w:line="360" w:lineRule="auto" w:before="40" w:after="40"/>
+              <w:spacing w:line="360" w:lineRule="auto"/>
             </w:pPr>
             <w:r/>
             <w:r>
@@ -2109,7 +1931,7 @@
                 <w:i w:val="0"/>
                 <w:sz w:val="20"/>
               </w:rPr>
-              <w:t>Application of scaffolded skills to independent design; persistence of methodological reasoning gains</w:t>
+              <w:t>Application to independent design; persistence of reasoning gains</w:t>
             </w:r>
           </w:p>
         </w:tc>
@@ -2128,7 +1950,7 @@
           </w:tcPr>
           <w:p>
             <w:pPr>
-              <w:spacing w:line="360" w:lineRule="auto" w:before="40" w:after="40"/>
+              <w:spacing w:line="360" w:lineRule="auto"/>
             </w:pPr>
             <w:r/>
             <w:r>
@@ -2138,7 +1960,7 @@
                 <w:i w:val="0"/>
                 <w:sz w:val="20"/>
               </w:rPr>
-              <w:t>Re-design task artifacts; follow-up interview</w:t>
+              <w:t>Re-design artifacts; follow-up interview</w:t>
             </w:r>
           </w:p>
         </w:tc>
@@ -2161,14 +1983,13 @@
           <w:rFonts w:ascii="Times New Roman" w:hAnsi="Times New Roman"/>
           <w:sz w:val="20"/>
         </w:rPr>
-        <w:t>Framework adapted from Tessmer and Richey (1997) as applied in Yang and Harbor (2023). The three-context model ensures that analysis accounts for factors before, during, and after the learning interaction.</w:t>
+        <w:t>Adapted from Tessmer and Richey (1997); applied per Yang and Harbor (2023).</w:t>
       </w:r>
     </w:p>
     <w:p/>
     <w:p>
       <w:pPr>
         <w:spacing w:before="240"/>
-        <w:jc w:val="left"/>
       </w:pPr>
       <w:r>
         <w:rPr>
@@ -2177,7 +1998,21 @@
           <w:i w:val="0"/>
           <w:sz w:val="24"/>
         </w:rPr>
-        <w:t>Phase 2: Mixed-Methods Evaluation</w:t>
+        <w:t>Phase 2: Counterbalanced Mixed-Methods Evaluation</w:t>
+      </w:r>
+    </w:p>
+    <w:p>
+      <w:pPr>
+        <w:spacing w:before="240"/>
+      </w:pPr>
+      <w:r>
+        <w:rPr>
+          <w:rFonts w:ascii="Times New Roman" w:hAnsi="Times New Roman"/>
+          <w:b/>
+          <w:i/>
+          <w:sz w:val="24"/>
+        </w:rPr>
+        <w:t>Participants and Platform Considerations</w:t>
       </w:r>
     </w:p>
     <w:p>
@@ -2191,13 +2026,12 @@
           <w:i w:val="0"/>
           <w:sz w:val="24"/>
         </w:rPr>
-        <w:t>Phase 2 employs a convergent mixed-methods design in which quantitative behavioral data and qualitative experiential data are collected concurrently and integrated during analysis. The design is modeled on Yang et al.’s (2025) approach to studying ChatGPT interactions among graduate students.</w:t>
+        <w:t>Participants will be 12 to 16 social science doctoral students from Penn State and Texas A&amp;M, recruited through departmental channels (not researcher-led workshops, to minimize recruitment pressure). Diverga requires the Claude Code CLI environment; accordingly, API access will be provided at no cost, and a 20-minute orientation will be conducted in a separate session prior to data collection to reduce priming effects. The sample is characterized as a purposive sample of doctoral students with basic CLI comfort. Transferability claims are bounded to this population.</w:t>
       </w:r>
     </w:p>
     <w:p>
       <w:pPr>
         <w:spacing w:before="240"/>
-        <w:jc w:val="left"/>
       </w:pPr>
       <w:r>
         <w:rPr>
@@ -2206,7 +2040,7 @@
           <w:i/>
           <w:sz w:val="24"/>
         </w:rPr>
-        <w:t>Participants</w:t>
+        <w:t>Counterbalanced Task Design</w:t>
       </w:r>
     </w:p>
     <w:p>
@@ -2220,13 +2054,12 @@
           <w:i w:val="0"/>
           <w:sz w:val="24"/>
         </w:rPr>
-        <w:t>Participants will be 12 to 16 social science doctoral students recruited from Pennsylvania State University and Texas A&amp;M University. The multi-site design strengthens transferability by capturing variation across institutional contexts. Inclusion criteria require completion of at least one research methodology course, prior experience with any AI tool, and basic familiarity with command-line interfaces. Participants with prior Diverga experience or computer science backgrounds will be excluded to ensure the evaluation captures authentic first encounters with the system.</w:t>
+        <w:t>To control for task sequence and practice effects, a counterbalanced design is employed. Two research design scenarios of equivalent complexity are used: Scenario A (AI tools in K-12 education) and Scenario B (AI collaboration tools and team creativity). Half the participants complete Scenario A without Diverga and Scenario B with Diverga; the other half complete the reverse. Both conditions receive equal time. Think-aloud protocol is used during the Diverga condition, and a semi-structured interview concludes each session.</w:t>
       </w:r>
     </w:p>
     <w:p>
       <w:pPr>
         <w:spacing w:before="240"/>
-        <w:jc w:val="left"/>
       </w:pPr>
       <w:r>
         <w:rPr>
@@ -2235,50 +2068,7 @@
           <w:i/>
           <w:sz w:val="24"/>
         </w:rPr>
-        <w:t>Task Design</w:t>
-      </w:r>
-    </w:p>
-    <w:p>
-      <w:pPr>
-        <w:ind w:firstLine="720"/>
-      </w:pPr>
-      <w:r>
-        <w:rPr>
-          <w:rFonts w:ascii="Times New Roman" w:hAnsi="Times New Roman"/>
-          <w:b w:val="0"/>
-          <w:i w:val="0"/>
-          <w:sz w:val="24"/>
-        </w:rPr>
-        <w:t>The evaluation employs a within-subjects design with two research design scenarios of varying familiarity. Participants first complete a pre-task without Diverga, designing a study on a familiar topic, to establish baseline methodological reasoning. Following a brief orientation to the system, participants complete a post-task with Diverga on an unfamiliar topic using think-aloud protocol, and then revisit the original scenario with Diverga to enable direct pre–post comparison. A semi-structured interview concludes the session.</w:t>
-      </w:r>
-    </w:p>
-    <w:p>
-      <w:pPr>
-        <w:spacing w:before="240"/>
-        <w:jc w:val="left"/>
-      </w:pPr>
-      <w:r>
-        <w:rPr>
-          <w:rFonts w:ascii="Times New Roman" w:hAnsi="Times New Roman"/>
-          <w:b/>
-          <w:i/>
-          <w:sz w:val="24"/>
-        </w:rPr>
-        <w:t>Data Sources and Analysis</w:t>
-      </w:r>
-    </w:p>
-    <w:p>
-      <w:pPr>
-        <w:ind w:firstLine="720"/>
-      </w:pPr>
-      <w:r>
-        <w:rPr>
-          <w:rFonts w:ascii="Times New Roman" w:hAnsi="Times New Roman"/>
-          <w:b w:val="0"/>
-          <w:i w:val="0"/>
-          <w:sz w:val="24"/>
-        </w:rPr>
-        <w:t>Table 3 presents the data sources, their alignment with research questions, and the analytic approach for each. The integration strategy employs joint displays aligning quantitative patterns with qualitative interpretations, and a convergence matrix identifying where findings agree or diverge.</w:t>
+        <w:t>Data Sources</w:t>
       </w:r>
     </w:p>
     <w:p>
@@ -2297,7 +2087,7 @@
     </w:p>
     <w:p>
       <w:pPr>
-        <w:spacing w:after="120"/>
+        <w:spacing w:after="80"/>
       </w:pPr>
       <w:r>
         <w:rPr>
@@ -2337,7 +2127,7 @@
           </w:tcPr>
           <w:p>
             <w:pPr>
-              <w:spacing w:line="360" w:lineRule="auto" w:before="80" w:after="80"/>
+              <w:spacing w:line="360" w:lineRule="auto"/>
             </w:pPr>
             <w:r/>
             <w:r>
@@ -2347,7 +2137,7 @@
                 <w:i/>
                 <w:sz w:val="20"/>
               </w:rPr>
-              <w:t>Data Source</w:t>
+              <w:t>Source</w:t>
             </w:r>
           </w:p>
         </w:tc>
@@ -2367,7 +2157,7 @@
           </w:tcPr>
           <w:p>
             <w:pPr>
-              <w:spacing w:line="360" w:lineRule="auto" w:before="80" w:after="80"/>
+              <w:spacing w:line="360" w:lineRule="auto"/>
             </w:pPr>
             <w:r/>
             <w:r>
@@ -2397,7 +2187,7 @@
           </w:tcPr>
           <w:p>
             <w:pPr>
-              <w:spacing w:line="360" w:lineRule="auto" w:before="80" w:after="80"/>
+              <w:spacing w:line="360" w:lineRule="auto"/>
             </w:pPr>
             <w:r/>
             <w:r>
@@ -2407,7 +2197,7 @@
                 <w:i/>
                 <w:sz w:val="20"/>
               </w:rPr>
-              <w:t>Analytic Approach</w:t>
+              <w:t>Approach</w:t>
             </w:r>
           </w:p>
         </w:tc>
@@ -2425,7 +2215,7 @@
           </w:tcPr>
           <w:p>
             <w:pPr>
-              <w:spacing w:line="360" w:lineRule="auto" w:before="40" w:after="40"/>
+              <w:spacing w:line="360" w:lineRule="auto"/>
             </w:pPr>
             <w:r/>
             <w:r>
@@ -2435,9 +2225,7 @@
                 <w:i w:val="0"/>
                 <w:sz w:val="20"/>
               </w:rPr>
-              <w:t>Checkpoint interaction logs</w:t>
-              <w:br/>
-              <w:t>(decision-log.yaml)</w:t>
+              <w:t>Checkpoint logs (passive server-side data)</w:t>
             </w:r>
           </w:p>
         </w:tc>
@@ -2453,7 +2241,7 @@
           </w:tcPr>
           <w:p>
             <w:pPr>
-              <w:spacing w:line="360" w:lineRule="auto" w:before="40" w:after="40"/>
+              <w:spacing w:line="360" w:lineRule="auto"/>
             </w:pPr>
             <w:r/>
             <w:r>
@@ -2479,7 +2267,7 @@
           </w:tcPr>
           <w:p>
             <w:pPr>
-              <w:spacing w:line="360" w:lineRule="auto" w:before="40" w:after="40"/>
+              <w:spacing w:line="360" w:lineRule="auto"/>
             </w:pPr>
             <w:r/>
             <w:r>
@@ -2489,7 +2277,7 @@
                 <w:i w:val="0"/>
                 <w:sz w:val="20"/>
               </w:rPr>
-              <w:t>Selection distributions; deliberation time patterns; T-Score choice frequencies</w:t>
+              <w:t>Descriptive: deliberation times, T-Score selection distributions</w:t>
             </w:r>
           </w:p>
         </w:tc>
@@ -2507,7 +2295,87 @@
           </w:tcPr>
           <w:p>
             <w:pPr>
-              <w:spacing w:line="360" w:lineRule="auto" w:before="40" w:after="40"/>
+              <w:spacing w:line="360" w:lineRule="auto"/>
+            </w:pPr>
+            <w:r/>
+            <w:r>
+              <w:rPr>
+                <w:rFonts w:ascii="Times New Roman" w:hAnsi="Times New Roman"/>
+                <w:b w:val="0"/>
+                <w:i w:val="0"/>
+                <w:sz w:val="20"/>
+              </w:rPr>
+              <w:t>Decision audit trail (participant-facing)</w:t>
+            </w:r>
+          </w:p>
+        </w:tc>
+        <w:tc>
+          <w:tcPr>
+            <w:tcW w:type="dxa" w:w="3120"/>
+            <w:tcBorders>
+              <w:top w:val="none" w:sz="0" w:space="0" w:color="auto"/>
+              <w:left w:val="none" w:sz="0" w:space="0" w:color="auto"/>
+              <w:bottom w:val="none" w:sz="0" w:space="0" w:color="auto"/>
+              <w:right w:val="none" w:sz="0" w:space="0" w:color="auto"/>
+            </w:tcBorders>
+          </w:tcPr>
+          <w:p>
+            <w:pPr>
+              <w:spacing w:line="360" w:lineRule="auto"/>
+            </w:pPr>
+            <w:r/>
+            <w:r>
+              <w:rPr>
+                <w:rFonts w:ascii="Times New Roman" w:hAnsi="Times New Roman"/>
+                <w:b w:val="0"/>
+                <w:i w:val="0"/>
+                <w:sz w:val="20"/>
+              </w:rPr>
+              <w:t>1</w:t>
+            </w:r>
+          </w:p>
+        </w:tc>
+        <w:tc>
+          <w:tcPr>
+            <w:tcW w:type="dxa" w:w="3120"/>
+            <w:tcBorders>
+              <w:top w:val="none" w:sz="0" w:space="0" w:color="auto"/>
+              <w:left w:val="none" w:sz="0" w:space="0" w:color="auto"/>
+              <w:bottom w:val="none" w:sz="0" w:space="0" w:color="auto"/>
+              <w:right w:val="none" w:sz="0" w:space="0" w:color="auto"/>
+            </w:tcBorders>
+          </w:tcPr>
+          <w:p>
+            <w:pPr>
+              <w:spacing w:line="360" w:lineRule="auto"/>
+            </w:pPr>
+            <w:r/>
+            <w:r>
+              <w:rPr>
+                <w:rFonts w:ascii="Times New Roman" w:hAnsi="Times New Roman"/>
+                <w:b w:val="0"/>
+                <w:i w:val="0"/>
+                <w:sz w:val="20"/>
+              </w:rPr>
+              <w:t>Separate from passive logs; analyzed as scaffolding interaction data</w:t>
+            </w:r>
+          </w:p>
+        </w:tc>
+      </w:tr>
+      <w:tr>
+        <w:tc>
+          <w:tcPr>
+            <w:tcW w:type="dxa" w:w="3120"/>
+            <w:tcBorders>
+              <w:top w:val="none" w:sz="0" w:space="0" w:color="auto"/>
+              <w:left w:val="none" w:sz="0" w:space="0" w:color="auto"/>
+              <w:bottom w:val="none" w:sz="0" w:space="0" w:color="auto"/>
+              <w:right w:val="none" w:sz="0" w:space="0" w:color="auto"/>
+            </w:tcBorders>
+          </w:tcPr>
+          <w:p>
+            <w:pPr>
+              <w:spacing w:line="360" w:lineRule="auto"/>
             </w:pPr>
             <w:r/>
             <w:r>
@@ -2533,7 +2401,7 @@
           </w:tcPr>
           <w:p>
             <w:pPr>
-              <w:spacing w:line="360" w:lineRule="auto" w:before="40" w:after="40"/>
+              <w:spacing w:line="360" w:lineRule="auto"/>
             </w:pPr>
             <w:r/>
             <w:r>
@@ -2559,7 +2427,7 @@
           </w:tcPr>
           <w:p>
             <w:pPr>
-              <w:spacing w:line="360" w:lineRule="auto" w:before="40" w:after="40"/>
+              <w:spacing w:line="360" w:lineRule="auto"/>
             </w:pPr>
             <w:r/>
             <w:r>
@@ -2569,7 +2437,7 @@
                 <w:i w:val="0"/>
                 <w:sz w:val="20"/>
               </w:rPr>
-              <w:t>Shannon Entropy Index for framework diversity; Wilcoxon signed-rank test</w:t>
+              <w:t>Shannon Entropy for diversity; rubric-based quality assessment</w:t>
             </w:r>
           </w:p>
         </w:tc>
@@ -2587,7 +2455,7 @@
           </w:tcPr>
           <w:p>
             <w:pPr>
-              <w:spacing w:line="360" w:lineRule="auto" w:before="40" w:after="40"/>
+              <w:spacing w:line="360" w:lineRule="auto"/>
             </w:pPr>
             <w:r/>
             <w:r>
@@ -2598,8 +2466,6 @@
                 <w:sz w:val="20"/>
               </w:rPr>
               <w:t>Think-aloud protocols</w:t>
-              <w:br/>
-              <w:t>(screen + audio)</w:t>
             </w:r>
           </w:p>
         </w:tc>
@@ -2615,7 +2481,7 @@
           </w:tcPr>
           <w:p>
             <w:pPr>
-              <w:spacing w:line="360" w:lineRule="auto" w:before="40" w:after="40"/>
+              <w:spacing w:line="360" w:lineRule="auto"/>
             </w:pPr>
             <w:r/>
             <w:r>
@@ -2641,7 +2507,7 @@
           </w:tcPr>
           <w:p>
             <w:pPr>
-              <w:spacing w:line="360" w:lineRule="auto" w:before="40" w:after="40"/>
+              <w:spacing w:line="360" w:lineRule="auto"/>
             </w:pPr>
             <w:r/>
             <w:r>
@@ -2651,7 +2517,7 @@
                 <w:i w:val="0"/>
                 <w:sz w:val="20"/>
               </w:rPr>
-              <w:t>Thematic analysis (Braun &amp; Clarke, 2006) with AL elements as sensitizing concepts</w:t>
+              <w:t>Thematic analysis with AL + inductive coding; independent dual-coder</w:t>
             </w:r>
           </w:p>
         </w:tc>
@@ -2669,7 +2535,7 @@
           </w:tcPr>
           <w:p>
             <w:pPr>
-              <w:spacing w:line="360" w:lineRule="auto" w:before="40" w:after="40"/>
+              <w:spacing w:line="360" w:lineRule="auto"/>
             </w:pPr>
             <w:r/>
             <w:r>
@@ -2695,7 +2561,7 @@
           </w:tcPr>
           <w:p>
             <w:pPr>
-              <w:spacing w:line="360" w:lineRule="auto" w:before="40" w:after="40"/>
+              <w:spacing w:line="360" w:lineRule="auto"/>
             </w:pPr>
             <w:r/>
             <w:r>
@@ -2721,7 +2587,7 @@
           </w:tcPr>
           <w:p>
             <w:pPr>
-              <w:spacing w:line="360" w:lineRule="auto" w:before="40" w:after="40"/>
+              <w:spacing w:line="360" w:lineRule="auto"/>
             </w:pPr>
             <w:r/>
             <w:r>
@@ -2731,7 +2597,7 @@
                 <w:i w:val="0"/>
                 <w:sz w:val="20"/>
               </w:rPr>
-              <w:t>Deductive coding (AL framework) + inductive open coding; cross-site comparison</w:t>
+              <w:t>Deductive (AL framework) + inductive coding; cross-site comparison</w:t>
             </w:r>
           </w:p>
         </w:tc>
@@ -2752,7 +2618,7 @@
           </w:tcPr>
           <w:p>
             <w:pPr>
-              <w:spacing w:line="360" w:lineRule="auto" w:before="40" w:after="40"/>
+              <w:spacing w:line="360" w:lineRule="auto"/>
             </w:pPr>
             <w:r/>
             <w:r>
@@ -2762,7 +2628,7 @@
                 <w:i w:val="0"/>
                 <w:sz w:val="20"/>
               </w:rPr>
-              <w:t>Screen recording behavioral data</w:t>
+              <w:t>Screen recording</w:t>
             </w:r>
           </w:p>
         </w:tc>
@@ -2781,7 +2647,7 @@
           </w:tcPr>
           <w:p>
             <w:pPr>
-              <w:spacing w:line="360" w:lineRule="auto" w:before="40" w:after="40"/>
+              <w:spacing w:line="360" w:lineRule="auto"/>
             </w:pPr>
             <w:r/>
             <w:r>
@@ -2810,7 +2676,7 @@
           </w:tcPr>
           <w:p>
             <w:pPr>
-              <w:spacing w:line="360" w:lineRule="auto" w:before="40" w:after="40"/>
+              <w:spacing w:line="360" w:lineRule="auto"/>
             </w:pPr>
             <w:r/>
             <w:r>
@@ -2843,7 +2709,7 @@
           <w:rFonts w:ascii="Times New Roman" w:hAnsi="Times New Roman"/>
           <w:sz w:val="20"/>
         </w:rPr>
-        <w:t>AL = authentic learning. Qualitative coding proceeds independently by both investigators in Round 1, followed by joint reconciliation to establish inter-rater reliability.</w:t>
+        <w:t>Passive log data (server-side timing, agent invocation) is distinguished from participant-facing audit trail data to avoid measurement-treatment confounds. Quantitative analyses are descriptive and exploratory given sample size. An independent coder (non-author) codes 25% of qualitative data for reliability.</w:t>
       </w:r>
     </w:p>
     <w:p/>
@@ -2859,7 +2725,21 @@
           <w:i w:val="0"/>
           <w:sz w:val="24"/>
         </w:rPr>
-        <w:t>Complementary Investigator Expertise</w:t>
+        <w:t>Anticipated Findings and Design Tensions</w:t>
+      </w:r>
+    </w:p>
+    <w:p>
+      <w:pPr>
+        <w:spacing w:before="240"/>
+      </w:pPr>
+      <w:r>
+        <w:rPr>
+          <w:rFonts w:ascii="Times New Roman" w:hAnsi="Times New Roman"/>
+          <w:b/>
+          <w:i w:val="0"/>
+          <w:sz w:val="24"/>
+        </w:rPr>
+        <w:t>RQ1: Manifestation of Authentic Learning Elements</w:t>
       </w:r>
     </w:p>
     <w:p>
@@ -2873,7 +2753,7 @@
           <w:i w:val="0"/>
           <w:sz w:val="24"/>
         </w:rPr>
-        <w:t>A distinctive strength of this study is the convergence of two complementary research programs. Table 4 maps how each investigator’s expertise addresses specific aspects of the research design. Notably, the existing Diverga evaluation proposal identifies the developer-researcher dual role as a methodological limitation requiring external collaboration. Yang’s independent pedagogical perspective and established track record in authentic learning research directly address this limitation, while You’s technical expertise in the Diverga platform and VS methodology provides the system-level knowledge necessary for the design case.</w:t>
+        <w:t>We anticipate differential manifestation across the nine elements. System-enforced elements—multiple perspectives (VS alternatives are automatically presented) and reflection (REQUIRED checkpoints physically halt progress)—should manifest strongly regardless of learner characteristics. Elements requiring voluntary engagement—collaboration (AI is not a true peer) and articulation (decision logs may be completed perfunctorily)—are expected to manifest weakly or inconsistently. This differential pattern, if confirmed, would suggest that AI scaffolding is most reliable when design features enforce engagement rather than merely invite it.</w:t>
       </w:r>
     </w:p>
     <w:p>
@@ -2887,585 +2767,7 @@
           <w:i w:val="0"/>
           <w:sz w:val="24"/>
         </w:rPr>
-        <w:t>Table 4</w:t>
-      </w:r>
-    </w:p>
-    <w:p>
-      <w:pPr>
-        <w:spacing w:after="120"/>
-      </w:pPr>
-      <w:r>
-        <w:rPr>
-          <w:rFonts w:ascii="Times New Roman" w:hAnsi="Times New Roman"/>
-          <w:b w:val="0"/>
-          <w:i/>
-          <w:sz w:val="24"/>
-        </w:rPr>
-        <w:t>Complementary Investigator Expertise and Research Design Contributions</w:t>
-      </w:r>
-    </w:p>
-    <w:tbl>
-      <w:tblPr>
-        <w:tblW w:type="auto" w:w="0"/>
-        <w:jc w:val="center"/>
-        <w:tblLook w:firstColumn="1" w:firstRow="1" w:lastColumn="0" w:lastRow="0" w:noHBand="0" w:noVBand="1" w:val="04A0"/>
-      </w:tblPr>
-      <w:tblGrid>
-        <w:gridCol w:w="3120"/>
-        <w:gridCol w:w="3120"/>
-        <w:gridCol w:w="3120"/>
-      </w:tblGrid>
-      <w:tr>
-        <w:tc>
-          <w:tcPr>
-            <w:tcW w:type="dxa" w:w="3120"/>
-            <w:tcBorders>
-              <w:top w:val="none" w:sz="0" w:space="0" w:color="auto"/>
-              <w:left w:val="none" w:sz="0" w:space="0" w:color="auto"/>
-              <w:bottom w:val="none" w:sz="0" w:space="0" w:color="auto"/>
-              <w:right w:val="none" w:sz="0" w:space="0" w:color="auto"/>
-            </w:tcBorders>
-            <w:tcBorders>
-              <w:top w:val="single" w:sz="12" w:space="0" w:color="000000"/>
-              <w:bottom w:val="single" w:sz="6" w:space="0" w:color="000000"/>
-            </w:tcBorders>
-          </w:tcPr>
-          <w:p>
-            <w:pPr>
-              <w:spacing w:line="360" w:lineRule="auto" w:before="80" w:after="80"/>
-            </w:pPr>
-            <w:r/>
-            <w:r>
-              <w:rPr>
-                <w:rFonts w:ascii="Times New Roman" w:hAnsi="Times New Roman"/>
-                <w:b/>
-                <w:i/>
-                <w:sz w:val="20"/>
-              </w:rPr>
-              <w:t>Dimension</w:t>
-            </w:r>
-          </w:p>
-        </w:tc>
-        <w:tc>
-          <w:tcPr>
-            <w:tcW w:type="dxa" w:w="3120"/>
-            <w:tcBorders>
-              <w:top w:val="none" w:sz="0" w:space="0" w:color="auto"/>
-              <w:left w:val="none" w:sz="0" w:space="0" w:color="auto"/>
-              <w:bottom w:val="none" w:sz="0" w:space="0" w:color="auto"/>
-              <w:right w:val="none" w:sz="0" w:space="0" w:color="auto"/>
-            </w:tcBorders>
-            <w:tcBorders>
-              <w:top w:val="single" w:sz="12" w:space="0" w:color="000000"/>
-              <w:bottom w:val="single" w:sz="6" w:space="0" w:color="000000"/>
-            </w:tcBorders>
-          </w:tcPr>
-          <w:p>
-            <w:pPr>
-              <w:spacing w:line="360" w:lineRule="auto" w:before="80" w:after="80"/>
-            </w:pPr>
-            <w:r/>
-            <w:r>
-              <w:rPr>
-                <w:rFonts w:ascii="Times New Roman" w:hAnsi="Times New Roman"/>
-                <w:b/>
-                <w:i/>
-                <w:sz w:val="20"/>
-              </w:rPr>
-              <w:t>Yang</w:t>
-            </w:r>
-          </w:p>
-        </w:tc>
-        <w:tc>
-          <w:tcPr>
-            <w:tcW w:type="dxa" w:w="3120"/>
-            <w:tcBorders>
-              <w:top w:val="none" w:sz="0" w:space="0" w:color="auto"/>
-              <w:left w:val="none" w:sz="0" w:space="0" w:color="auto"/>
-              <w:bottom w:val="none" w:sz="0" w:space="0" w:color="auto"/>
-              <w:right w:val="none" w:sz="0" w:space="0" w:color="auto"/>
-            </w:tcBorders>
-            <w:tcBorders>
-              <w:top w:val="single" w:sz="12" w:space="0" w:color="000000"/>
-              <w:bottom w:val="single" w:sz="6" w:space="0" w:color="000000"/>
-            </w:tcBorders>
-          </w:tcPr>
-          <w:p>
-            <w:pPr>
-              <w:spacing w:line="360" w:lineRule="auto" w:before="80" w:after="80"/>
-            </w:pPr>
-            <w:r/>
-            <w:r>
-              <w:rPr>
-                <w:rFonts w:ascii="Times New Roman" w:hAnsi="Times New Roman"/>
-                <w:b/>
-                <w:i/>
-                <w:sz w:val="20"/>
-              </w:rPr>
-              <w:t>You</w:t>
-            </w:r>
-          </w:p>
-        </w:tc>
-      </w:tr>
-      <w:tr>
-        <w:tc>
-          <w:tcPr>
-            <w:tcW w:type="dxa" w:w="3120"/>
-            <w:tcBorders>
-              <w:top w:val="none" w:sz="0" w:space="0" w:color="auto"/>
-              <w:left w:val="none" w:sz="0" w:space="0" w:color="auto"/>
-              <w:bottom w:val="none" w:sz="0" w:space="0" w:color="auto"/>
-              <w:right w:val="none" w:sz="0" w:space="0" w:color="auto"/>
-            </w:tcBorders>
-          </w:tcPr>
-          <w:p>
-            <w:pPr>
-              <w:spacing w:line="360" w:lineRule="auto" w:before="40" w:after="40"/>
-            </w:pPr>
-            <w:r/>
-            <w:r>
-              <w:rPr>
-                <w:rFonts w:ascii="Times New Roman" w:hAnsi="Times New Roman"/>
-                <w:b w:val="0"/>
-                <w:i w:val="0"/>
-                <w:sz w:val="20"/>
-              </w:rPr>
-              <w:t>Theoretical lens</w:t>
-            </w:r>
-          </w:p>
-        </w:tc>
-        <w:tc>
-          <w:tcPr>
-            <w:tcW w:type="dxa" w:w="3120"/>
-            <w:tcBorders>
-              <w:top w:val="none" w:sz="0" w:space="0" w:color="auto"/>
-              <w:left w:val="none" w:sz="0" w:space="0" w:color="auto"/>
-              <w:bottom w:val="none" w:sz="0" w:space="0" w:color="auto"/>
-              <w:right w:val="none" w:sz="0" w:space="0" w:color="auto"/>
-            </w:tcBorders>
-          </w:tcPr>
-          <w:p>
-            <w:pPr>
-              <w:spacing w:line="360" w:lineRule="auto" w:before="40" w:after="40"/>
-            </w:pPr>
-            <w:r/>
-            <w:r>
-              <w:rPr>
-                <w:rFonts w:ascii="Times New Roman" w:hAnsi="Times New Roman"/>
-                <w:b w:val="0"/>
-                <w:i w:val="0"/>
-                <w:sz w:val="20"/>
-              </w:rPr>
-              <w:t>Authentic learning; transfer of training</w:t>
-            </w:r>
-          </w:p>
-        </w:tc>
-        <w:tc>
-          <w:tcPr>
-            <w:tcW w:type="dxa" w:w="3120"/>
-            <w:tcBorders>
-              <w:top w:val="none" w:sz="0" w:space="0" w:color="auto"/>
-              <w:left w:val="none" w:sz="0" w:space="0" w:color="auto"/>
-              <w:bottom w:val="none" w:sz="0" w:space="0" w:color="auto"/>
-              <w:right w:val="none" w:sz="0" w:space="0" w:color="auto"/>
-            </w:tcBorders>
-          </w:tcPr>
-          <w:p>
-            <w:pPr>
-              <w:spacing w:line="360" w:lineRule="auto" w:before="40" w:after="40"/>
-            </w:pPr>
-            <w:r/>
-            <w:r>
-              <w:rPr>
-                <w:rFonts w:ascii="Times New Roman" w:hAnsi="Times New Roman"/>
-                <w:b w:val="0"/>
-                <w:i w:val="0"/>
-                <w:sz w:val="20"/>
-              </w:rPr>
-              <w:t>Verbalized Sampling; mode collapse theory</w:t>
-            </w:r>
-          </w:p>
-        </w:tc>
-      </w:tr>
-      <w:tr>
-        <w:tc>
-          <w:tcPr>
-            <w:tcW w:type="dxa" w:w="3120"/>
-            <w:tcBorders>
-              <w:top w:val="none" w:sz="0" w:space="0" w:color="auto"/>
-              <w:left w:val="none" w:sz="0" w:space="0" w:color="auto"/>
-              <w:bottom w:val="none" w:sz="0" w:space="0" w:color="auto"/>
-              <w:right w:val="none" w:sz="0" w:space="0" w:color="auto"/>
-            </w:tcBorders>
-          </w:tcPr>
-          <w:p>
-            <w:pPr>
-              <w:spacing w:line="360" w:lineRule="auto" w:before="40" w:after="40"/>
-            </w:pPr>
-            <w:r/>
-            <w:r>
-              <w:rPr>
-                <w:rFonts w:ascii="Times New Roman" w:hAnsi="Times New Roman"/>
-                <w:b w:val="0"/>
-                <w:i w:val="0"/>
-                <w:sz w:val="20"/>
-              </w:rPr>
-              <w:t>Technical platform</w:t>
-            </w:r>
-          </w:p>
-        </w:tc>
-        <w:tc>
-          <w:tcPr>
-            <w:tcW w:type="dxa" w:w="3120"/>
-            <w:tcBorders>
-              <w:top w:val="none" w:sz="0" w:space="0" w:color="auto"/>
-              <w:left w:val="none" w:sz="0" w:space="0" w:color="auto"/>
-              <w:bottom w:val="none" w:sz="0" w:space="0" w:color="auto"/>
-              <w:right w:val="none" w:sz="0" w:space="0" w:color="auto"/>
-            </w:tcBorders>
-          </w:tcPr>
-          <w:p>
-            <w:pPr>
-              <w:spacing w:line="360" w:lineRule="auto" w:before="40" w:after="40"/>
-            </w:pPr>
-            <w:r/>
-            <w:r>
-              <w:rPr>
-                <w:rFonts w:ascii="Times New Roman" w:hAnsi="Times New Roman"/>
-                <w:b w:val="0"/>
-                <w:i w:val="0"/>
-                <w:sz w:val="20"/>
-              </w:rPr>
-              <w:t>MCP architecture (dynamic learner state)</w:t>
-            </w:r>
-          </w:p>
-        </w:tc>
-        <w:tc>
-          <w:tcPr>
-            <w:tcW w:type="dxa" w:w="3120"/>
-            <w:tcBorders>
-              <w:top w:val="none" w:sz="0" w:space="0" w:color="auto"/>
-              <w:left w:val="none" w:sz="0" w:space="0" w:color="auto"/>
-              <w:bottom w:val="none" w:sz="0" w:space="0" w:color="auto"/>
-              <w:right w:val="none" w:sz="0" w:space="0" w:color="auto"/>
-            </w:tcBorders>
-          </w:tcPr>
-          <w:p>
-            <w:pPr>
-              <w:spacing w:line="360" w:lineRule="auto" w:before="40" w:after="40"/>
-            </w:pPr>
-            <w:r/>
-            <w:r>
-              <w:rPr>
-                <w:rFonts w:ascii="Times New Roman" w:hAnsi="Times New Roman"/>
-                <w:b w:val="0"/>
-                <w:i w:val="0"/>
-                <w:sz w:val="20"/>
-              </w:rPr>
-              <w:t>Diverga platform (44 MCP-based agents)</w:t>
-            </w:r>
-          </w:p>
-        </w:tc>
-      </w:tr>
-      <w:tr>
-        <w:tc>
-          <w:tcPr>
-            <w:tcW w:type="dxa" w:w="3120"/>
-            <w:tcBorders>
-              <w:top w:val="none" w:sz="0" w:space="0" w:color="auto"/>
-              <w:left w:val="none" w:sz="0" w:space="0" w:color="auto"/>
-              <w:bottom w:val="none" w:sz="0" w:space="0" w:color="auto"/>
-              <w:right w:val="none" w:sz="0" w:space="0" w:color="auto"/>
-            </w:tcBorders>
-          </w:tcPr>
-          <w:p>
-            <w:pPr>
-              <w:spacing w:line="360" w:lineRule="auto" w:before="40" w:after="40"/>
-            </w:pPr>
-            <w:r/>
-            <w:r>
-              <w:rPr>
-                <w:rFonts w:ascii="Times New Roman" w:hAnsi="Times New Roman"/>
-                <w:b w:val="0"/>
-                <w:i w:val="0"/>
-                <w:sz w:val="20"/>
-              </w:rPr>
-              <w:t>Design methodology</w:t>
-            </w:r>
-          </w:p>
-        </w:tc>
-        <w:tc>
-          <w:tcPr>
-            <w:tcW w:type="dxa" w:w="3120"/>
-            <w:tcBorders>
-              <w:top w:val="none" w:sz="0" w:space="0" w:color="auto"/>
-              <w:left w:val="none" w:sz="0" w:space="0" w:color="auto"/>
-              <w:bottom w:val="none" w:sz="0" w:space="0" w:color="auto"/>
-              <w:right w:val="none" w:sz="0" w:space="0" w:color="auto"/>
-            </w:tcBorders>
-          </w:tcPr>
-          <w:p>
-            <w:pPr>
-              <w:spacing w:line="360" w:lineRule="auto" w:before="40" w:after="40"/>
-            </w:pPr>
-            <w:r/>
-            <w:r>
-              <w:rPr>
-                <w:rFonts w:ascii="Times New Roman" w:hAnsi="Times New Roman"/>
-                <w:b w:val="0"/>
-                <w:i w:val="0"/>
-                <w:sz w:val="20"/>
-              </w:rPr>
-              <w:t>LXD; design case; learner analysis</w:t>
-            </w:r>
-          </w:p>
-        </w:tc>
-        <w:tc>
-          <w:tcPr>
-            <w:tcW w:type="dxa" w:w="3120"/>
-            <w:tcBorders>
-              <w:top w:val="none" w:sz="0" w:space="0" w:color="auto"/>
-              <w:left w:val="none" w:sz="0" w:space="0" w:color="auto"/>
-              <w:bottom w:val="none" w:sz="0" w:space="0" w:color="auto"/>
-              <w:right w:val="none" w:sz="0" w:space="0" w:color="auto"/>
-            </w:tcBorders>
-          </w:tcPr>
-          <w:p>
-            <w:pPr>
-              <w:spacing w:line="360" w:lineRule="auto" w:before="40" w:after="40"/>
-            </w:pPr>
-            <w:r/>
-            <w:r>
-              <w:rPr>
-                <w:rFonts w:ascii="Times New Roman" w:hAnsi="Times New Roman"/>
-                <w:b w:val="0"/>
-                <w:i w:val="0"/>
-                <w:sz w:val="20"/>
-              </w:rPr>
-              <w:t>EDR; Activity Theory; Conjecture Mapping</w:t>
-            </w:r>
-          </w:p>
-        </w:tc>
-      </w:tr>
-      <w:tr>
-        <w:tc>
-          <w:tcPr>
-            <w:tcW w:type="dxa" w:w="3120"/>
-            <w:tcBorders>
-              <w:top w:val="none" w:sz="0" w:space="0" w:color="auto"/>
-              <w:left w:val="none" w:sz="0" w:space="0" w:color="auto"/>
-              <w:bottom w:val="none" w:sz="0" w:space="0" w:color="auto"/>
-              <w:right w:val="none" w:sz="0" w:space="0" w:color="auto"/>
-            </w:tcBorders>
-          </w:tcPr>
-          <w:p>
-            <w:pPr>
-              <w:spacing w:line="360" w:lineRule="auto" w:before="40" w:after="40"/>
-            </w:pPr>
-            <w:r/>
-            <w:r>
-              <w:rPr>
-                <w:rFonts w:ascii="Times New Roman" w:hAnsi="Times New Roman"/>
-                <w:b w:val="0"/>
-                <w:i w:val="0"/>
-                <w:sz w:val="20"/>
-              </w:rPr>
-              <w:t>AI tool research</w:t>
-            </w:r>
-          </w:p>
-        </w:tc>
-        <w:tc>
-          <w:tcPr>
-            <w:tcW w:type="dxa" w:w="3120"/>
-            <w:tcBorders>
-              <w:top w:val="none" w:sz="0" w:space="0" w:color="auto"/>
-              <w:left w:val="none" w:sz="0" w:space="0" w:color="auto"/>
-              <w:bottom w:val="none" w:sz="0" w:space="0" w:color="auto"/>
-              <w:right w:val="none" w:sz="0" w:space="0" w:color="auto"/>
-            </w:tcBorders>
-          </w:tcPr>
-          <w:p>
-            <w:pPr>
-              <w:spacing w:line="360" w:lineRule="auto" w:before="40" w:after="40"/>
-            </w:pPr>
-            <w:r/>
-            <w:r>
-              <w:rPr>
-                <w:rFonts w:ascii="Times New Roman" w:hAnsi="Times New Roman"/>
-                <w:b w:val="0"/>
-                <w:i w:val="0"/>
-                <w:sz w:val="20"/>
-              </w:rPr>
-              <w:t>ChatGPT mixed-methods study (BJET, 2025)</w:t>
-            </w:r>
-          </w:p>
-        </w:tc>
-        <w:tc>
-          <w:tcPr>
-            <w:tcW w:type="dxa" w:w="3120"/>
-            <w:tcBorders>
-              <w:top w:val="none" w:sz="0" w:space="0" w:color="auto"/>
-              <w:left w:val="none" w:sz="0" w:space="0" w:color="auto"/>
-              <w:bottom w:val="none" w:sz="0" w:space="0" w:color="auto"/>
-              <w:right w:val="none" w:sz="0" w:space="0" w:color="auto"/>
-            </w:tcBorders>
-          </w:tcPr>
-          <w:p>
-            <w:pPr>
-              <w:spacing w:line="360" w:lineRule="auto" w:before="40" w:after="40"/>
-            </w:pPr>
-            <w:r/>
-            <w:r>
-              <w:rPr>
-                <w:rFonts w:ascii="Times New Roman" w:hAnsi="Times New Roman"/>
-                <w:b w:val="0"/>
-                <w:i w:val="0"/>
-                <w:sz w:val="20"/>
-              </w:rPr>
-              <w:t>Diverga evaluation proposal; comparative analysis</w:t>
-            </w:r>
-          </w:p>
-        </w:tc>
-      </w:tr>
-      <w:tr>
-        <w:tc>
-          <w:tcPr>
-            <w:tcW w:type="dxa" w:w="3120"/>
-            <w:tcBorders>
-              <w:top w:val="none" w:sz="0" w:space="0" w:color="auto"/>
-              <w:left w:val="none" w:sz="0" w:space="0" w:color="auto"/>
-              <w:bottom w:val="none" w:sz="0" w:space="0" w:color="auto"/>
-              <w:right w:val="none" w:sz="0" w:space="0" w:color="auto"/>
-            </w:tcBorders>
-            <w:tcBorders>
-              <w:bottom w:val="single" w:sz="12" w:space="0" w:color="000000"/>
-            </w:tcBorders>
-          </w:tcPr>
-          <w:p>
-            <w:pPr>
-              <w:spacing w:line="360" w:lineRule="auto" w:before="40" w:after="40"/>
-            </w:pPr>
-            <w:r/>
-            <w:r>
-              <w:rPr>
-                <w:rFonts w:ascii="Times New Roman" w:hAnsi="Times New Roman"/>
-                <w:b w:val="0"/>
-                <w:i w:val="0"/>
-                <w:sz w:val="20"/>
-              </w:rPr>
-              <w:t>Institutional access</w:t>
-            </w:r>
-          </w:p>
-        </w:tc>
-        <w:tc>
-          <w:tcPr>
-            <w:tcW w:type="dxa" w:w="3120"/>
-            <w:tcBorders>
-              <w:top w:val="none" w:sz="0" w:space="0" w:color="auto"/>
-              <w:left w:val="none" w:sz="0" w:space="0" w:color="auto"/>
-              <w:bottom w:val="none" w:sz="0" w:space="0" w:color="auto"/>
-              <w:right w:val="none" w:sz="0" w:space="0" w:color="auto"/>
-            </w:tcBorders>
-            <w:tcBorders>
-              <w:bottom w:val="single" w:sz="12" w:space="0" w:color="000000"/>
-            </w:tcBorders>
-          </w:tcPr>
-          <w:p>
-            <w:pPr>
-              <w:spacing w:line="360" w:lineRule="auto" w:before="40" w:after="40"/>
-            </w:pPr>
-            <w:r/>
-            <w:r>
-              <w:rPr>
-                <w:rFonts w:ascii="Times New Roman" w:hAnsi="Times New Roman"/>
-                <w:b w:val="0"/>
-                <w:i w:val="0"/>
-                <w:sz w:val="20"/>
-              </w:rPr>
-              <w:t>Texas A&amp;M doctoral students</w:t>
-            </w:r>
-          </w:p>
-        </w:tc>
-        <w:tc>
-          <w:tcPr>
-            <w:tcW w:type="dxa" w:w="3120"/>
-            <w:tcBorders>
-              <w:top w:val="none" w:sz="0" w:space="0" w:color="auto"/>
-              <w:left w:val="none" w:sz="0" w:space="0" w:color="auto"/>
-              <w:bottom w:val="none" w:sz="0" w:space="0" w:color="auto"/>
-              <w:right w:val="none" w:sz="0" w:space="0" w:color="auto"/>
-            </w:tcBorders>
-            <w:tcBorders>
-              <w:bottom w:val="single" w:sz="12" w:space="0" w:color="000000"/>
-            </w:tcBorders>
-          </w:tcPr>
-          <w:p>
-            <w:pPr>
-              <w:spacing w:line="360" w:lineRule="auto" w:before="40" w:after="40"/>
-            </w:pPr>
-            <w:r/>
-            <w:r>
-              <w:rPr>
-                <w:rFonts w:ascii="Times New Roman" w:hAnsi="Times New Roman"/>
-                <w:b w:val="0"/>
-                <w:i w:val="0"/>
-                <w:sz w:val="20"/>
-              </w:rPr>
-              <w:t>Penn State doctoral students</w:t>
-            </w:r>
-          </w:p>
-        </w:tc>
-      </w:tr>
-    </w:tbl>
-    <w:p>
-      <w:pPr>
-        <w:spacing w:before="80"/>
-      </w:pPr>
-      <w:r>
-        <w:rPr>
-          <w:rFonts w:ascii="Times New Roman" w:hAnsi="Times New Roman"/>
-          <w:i/>
-          <w:sz w:val="20"/>
-        </w:rPr>
-        <w:t xml:space="preserve">Note. </w:t>
-      </w:r>
-      <w:r>
-        <w:rPr>
-          <w:rFonts w:ascii="Times New Roman" w:hAnsi="Times New Roman"/>
-          <w:sz w:val="20"/>
-        </w:rPr>
-        <w:t>MCP = Model Context Protocol; LXD = Learning Experience Design; EDR = Educational Design Research; BJET = British Journal of Educational Technology.</w:t>
-      </w:r>
-    </w:p>
-    <w:p/>
-    <w:p>
-      <w:pPr>
-        <w:spacing w:before="240"/>
-        <w:jc w:val="center"/>
-      </w:pPr>
-      <w:r>
-        <w:rPr>
-          <w:rFonts w:ascii="Times New Roman" w:hAnsi="Times New Roman"/>
-          <w:b/>
-          <w:i w:val="0"/>
-          <w:sz w:val="24"/>
-        </w:rPr>
-        <w:t>Expected Contributions</w:t>
-      </w:r>
-    </w:p>
-    <w:p>
-      <w:pPr>
-        <w:spacing w:before="240"/>
-        <w:jc w:val="left"/>
-      </w:pPr>
-      <w:r>
-        <w:rPr>
-          <w:rFonts w:ascii="Times New Roman" w:hAnsi="Times New Roman"/>
-          <w:b/>
-          <w:i w:val="0"/>
-          <w:sz w:val="24"/>
-        </w:rPr>
-        <w:t>Theoretical Contributions</w:t>
+        <w:t>RQ2: Effects on Methodological Choice Diversity and Quality</w:t>
       </w:r>
     </w:p>
     <w:p>
@@ -3479,13 +2781,12 @@
           <w:i w:val="0"/>
           <w:sz w:val="24"/>
         </w:rPr>
-        <w:t>This study makes three theoretical contributions. First, it proposes an authentic AI scaffolding framework—the first application of Herrington et al.’s (2010) authentic learning theory to multi-agent AI research tools. Second, it develops a checkpoint-as-scaffold model that reconceptualizes human checkpoints from simple approval gates to epistemic scaffolds that activate methodological reasoning through forced reflection, perspective expansion, and reasoning externalization. Third, it extends Yang and Harbor’s (2023) findings on learner analysis to AI-mediated contexts, demonstrating that the same learner-centered design principles that determine success in face-to-face authentic learning also apply to AI tool design.</w:t>
+        <w:t>We expect pre–post Shannon Entropy to increase, reflecting greater diversity in framework selection after Diverga use. T-Score selection patterns should show initial gravitation toward high-T-Score (modal) options, with gradual exploration of lower-T-Score alternatives as participants become comfortable with the interface. However, increased diversity does not automatically signal improved quality—some participants may select unconventional frameworks that are poorly suited to their research questions, driven by the novelty of seeing non-modal options rather than genuine methodological reasoning. The qualitative strand is essential for distinguishing between authentic perspective expansion and superficial diversity.</w:t>
       </w:r>
     </w:p>
     <w:p>
       <w:pPr>
         <w:spacing w:before="240"/>
-        <w:jc w:val="left"/>
       </w:pPr>
       <w:r>
         <w:rPr>
@@ -3494,7 +2795,7 @@
           <w:i w:val="0"/>
           <w:sz w:val="24"/>
         </w:rPr>
-        <w:t>Practical Contributions</w:t>
+        <w:t>RQ3: Anticipated Design Tensions</w:t>
       </w:r>
     </w:p>
     <w:p>
@@ -3508,22 +2809,7 @@
           <w:i w:val="0"/>
           <w:sz w:val="24"/>
         </w:rPr>
-        <w:t>The study generates evidence-based design principles for AI research tool developers, specifying guidelines for checkpoint placement, VS integration, and scaffolding calibration. The multi-site validation at two institutions strengthens the transferability of these principles across institutional contexts.</w:t>
-      </w:r>
-    </w:p>
-    <w:p>
-      <w:pPr>
-        <w:spacing w:before="240"/>
-        <w:jc w:val="left"/>
-      </w:pPr>
-      <w:r>
-        <w:rPr>
-          <w:rFonts w:ascii="Times New Roman" w:hAnsi="Times New Roman"/>
-          <w:b/>
-          <w:i w:val="0"/>
-          <w:sz w:val="24"/>
-        </w:rPr>
-        <w:t>Methodological Contributions</w:t>
+        <w:t>Four design tensions are predicted based on the theoretical framework and Yang and Harbor’s (2023) failure categories. First, a scaffolding–efficiency tension: checkpoints slow the process, and participants under time pressure may experience them as interruptions rather than scaffolds. Second, a diversity–quality tension: more options do not guarantee better choices. Third, an AI authority–learner autonomy tension: despite checkpoints, participants may still defer to the AI’s framing of alternatives. Fourth, a CLI barrier–flow tension: the technical overhead of the command-line interface may detract from research design engagement, particularly for participants with lower technical comfort.</w:t>
       </w:r>
     </w:p>
     <w:p>
@@ -3537,7 +2823,7 @@
           <w:i w:val="0"/>
           <w:sz w:val="24"/>
         </w:rPr>
-        <w:t>The integration of an LXD-informed design case with systematic learner and contextual analysis offers a replicable methodology for studying AI educational tools. The use of Diverga’s decision audit trail as behavioral research data establishes a precedent for leveraging built-in AI tool logs in educational research—an approach that enhances ecological validity by capturing authentic interaction patterns rather than relying solely on self-report.</w:t>
+        <w:t>Learner characteristics from Phase 1 are expected to mediate these tensions. Participants with stronger research methods training should engage more deeply at checkpoints. Those with extensive AI experience may, paradoxically, exhibit stronger automation bias due to habituated trust. Epistemological orientation may also matter: constructivist-oriented participants may naturally embrace multiple perspectives, while positivist-oriented participants may find the multiplicity of options disorienting when seeking a single optimal approach.</w:t>
       </w:r>
     </w:p>
     <w:p>
@@ -3552,7 +2838,7 @@
           <w:i w:val="0"/>
           <w:sz w:val="24"/>
         </w:rPr>
-        <w:t>Future Directions</w:t>
+        <w:t>Significance and Contributions</w:t>
       </w:r>
     </w:p>
     <w:p>
@@ -3566,7 +2852,21 @@
           <w:i w:val="0"/>
           <w:sz w:val="24"/>
         </w:rPr>
-        <w:t>This study is designed as the first in a programmatic line of research. Subsequent investigations will examine whether research design skills scaffolded by checkpoints transfer to unassisted contexts, drawing on transfer of training theory. A comparative study contrasting multi-agent scaffolding (Diverga) with single-agent AI (ChatGPT) and no-AI conditions will isolate the contribution of specific design features. A full three-cycle Educational Design Research study will iteratively refine the design principles generated here, extending eventually to cross-disciplinary contexts in STEM and humanities research methodology.</w:t>
+        <w:t>This study makes three contributions. Theoretically, it produces an authentic AI scaffolding framework—the first application of Herrington et al.’s (2010) framework to multi-agent AI tools—specifying which authentic learning elements are effectively operationalized by AI and under what conditions. It extends Yang and Harbor’s (2023) findings to AI-mediated contexts, demonstrating whether the same learner-centered design principles apply. Practically, it generates evidence-based design principles for AI research tool developers regarding checkpoint placement, VS integration, and scaffolding calibration. Methodologically, the combination of LXD design case, learner analysis, and counterbalanced mixed-methods evaluation offers a replicable template for studying AI educational tools, while the use of system-generated logs as behavioral data establishes a methodological precedent.</w:t>
+      </w:r>
+    </w:p>
+    <w:p>
+      <w:pPr>
+        <w:ind w:firstLine="720"/>
+      </w:pPr>
+      <w:r>
+        <w:rPr>
+          <w:rFonts w:ascii="Times New Roman" w:hAnsi="Times New Roman"/>
+          <w:b w:val="0"/>
+          <w:i w:val="0"/>
+          <w:sz w:val="24"/>
+        </w:rPr>
+        <w:t>This study is the first in a programmatic agenda. Subsequent work will examine transfer of scaffolded skills to unassisted contexts, compare multi-agent (Diverga) versus single-agent (ChatGPT) conditions, and extend to cross-disciplinary contexts.</w:t>
       </w:r>
     </w:p>
     <w:p>
@@ -3638,20 +2938,6 @@
           <w:sz w:val="24"/>
         </w:rPr>
         <w:t>Creswell, J. W., &amp; Plano Clark, V. L. (2018). Designing and conducting mixed methods research (3rd ed.). SAGE.</w:t>
-      </w:r>
-    </w:p>
-    <w:p>
-      <w:pPr>
-        <w:ind w:left="720" w:hanging="720"/>
-      </w:pPr>
-      <w:r>
-        <w:rPr>
-          <w:rFonts w:ascii="Times New Roman" w:hAnsi="Times New Roman"/>
-          <w:b w:val="0"/>
-          <w:i w:val="0"/>
-          <w:sz w:val="24"/>
-        </w:rPr>
-        <w:t>Davidson-Shivers, G. V., Rasmussen, K. L., &amp; Lowenthal, P. R. (2018). Web-based learning: Design, implementation, and evaluation (2nd ed.). Springer.</w:t>
       </w:r>
     </w:p>
     <w:p>

</xml_diff>

<commit_message>
Fix citation hallucinations: add missing references and correct in-text citations
- Replace (Microsoft Research, 2025) → (Lee et al., 2025) in body text
- Replace (arXiv:2510.01171) → (Zhang et al., 2025) in body text (2 occurrences)
- Add Lee et al. (2025) CHI paper to reference list (doi:10.1145/3706598.3713778)
- Add Zhang et al. (2025) Verbalized Sampling arXiv paper to reference list
- References inserted in correct APA alphabetical order

Co-Authored-By: Claude Sonnet 4.6 (1M context) <noreply@anthropic.com>
</commit_message>
<xml_diff>
--- a/You_Yang_2026_Research_Design_Draft.docx
+++ b/You_Yang_2026_Research_Design_Draft.docx
@@ -250,7 +250,7 @@
           <w:i w:val="0"/>
           <w:sz w:val="24"/>
         </w:rPr>
-        <w:t>Two structural problems characterize current AI research tools. Mode collapse occurs when AI converges on predictable, modal recommendations reflecting typicality bias in training data (arXiv:2510.01171). Automation bias—the tendency to accept AI suggestions without critical evaluation—compounds this problem. AI tool usage has been found to correlate negatively with critical thinking, mediated by cognitive offloading (Microsoft Research, 2025). Together, these problems risk homogenizing the methodological landscape of social science research at precisely the moment when AI tools are being most rapidly adopted.</w:t>
+        <w:t>Two structural problems characterize current AI research tools. Mode collapse occurs when AI converges on predictable, modal recommendations reflecting typicality bias in training data (Zhang et al., 2025). Automation bias—the tendency to accept AI suggestions without critical evaluation—compounds this problem. AI tool usage has been found to correlate negatively with critical thinking, mediated by cognitive offloading (Lee et al., 2025). Together, these problems risk homogenizing the methodological landscape of social science research at precisely the moment when AI tools are being most rapidly adopted.</w:t>
       </w:r>
     </w:p>
     <w:p>
@@ -1354,7 +1354,7 @@
           <w:i w:val="0"/>
           <w:sz w:val="24"/>
         </w:rPr>
-        <w:t>Verbalized Sampling (arXiv:2510.01171) mitigates mode collapse by generating multiple alternatives with typicality scores, directly operationalizing the “multiple perspectives” element. The Model Context Protocol (Yang et al., 2025) orchestrates 44 specialized agents, enabling domain-specific scaffolding. The core conjecture is: When these mechanisms are implemented through structured human checkpoints, they scaffold researchers’ reasoning through forced reflection, perspective expansion, and reasoning externalization—conditional on systematic learner and contextual analysis.</w:t>
+        <w:t>Verbalized Sampling (Zhang et al., 2025) mitigates mode collapse by generating multiple alternatives with typicality scores, directly operationalizing the “multiple perspectives” element. The Model Context Protocol (Yang et al., 2025) orchestrates 44 specialized agents, enabling domain-specific scaffolding. The core conjecture is: When these mechanisms are implemented through structured human checkpoints, they scaffold researchers’ reasoning through forced reflection, perspective expansion, and reasoning externalization—conditional on systematic learner and contextual analysis.</w:t>
       </w:r>
     </w:p>
     <w:p>
@@ -2979,6 +2979,20 @@
           <w:i w:val="0"/>
           <w:sz w:val="24"/>
         </w:rPr>
+        <w:t xml:space="preserve">Lee, H.-P., Sarkar, A., Tankelevitch, L., Drosos, I., Rintel, S., Banks, R., &amp; Wilson, N. (2025). The impact of generative AI on critical thinking: Self-reported reductions in cognitive effort and confidence effects from a survey of knowledge workers. Proceedings of the 2025 CHI Conference on Human Factors in Computing Systems, Article 694. https://doi.org/10.1145/3706598.3713778</w:t>
+      </w:r>
+    </w:p>
+    <w:p>
+      <w:pPr>
+        <w:ind w:left="720" w:hanging="720"/>
+      </w:pPr>
+      <w:r>
+        <w:rPr>
+          <w:rFonts w:ascii="Times New Roman" w:hAnsi="Times New Roman"/>
+          <w:b w:val="0"/>
+          <w:i w:val="0"/>
+          <w:sz w:val="24"/>
+        </w:rPr>
         <w:t>Smith, K. M. (2010). Producing the rigorous design case. International Journal of Designs for Learning, 1(1), 9–20.</w:t>
       </w:r>
     </w:p>
@@ -3036,6 +3050,20 @@
           <w:sz w:val="24"/>
         </w:rPr>
         <w:t>Yang, M., Lovett, N., Li, B., &amp; Hou, Z. (2025). Towards dynamic learner state: Orchestrating AI agents and workplace performance via the Model Context Protocol. Education Sciences, 15(8), 1004.</w:t>
+      </w:r>
+    </w:p>
+    <w:p>
+      <w:pPr>
+        <w:ind w:left="720" w:hanging="720"/>
+      </w:pPr>
+      <w:r>
+        <w:rPr>
+          <w:rFonts w:ascii="Times New Roman" w:hAnsi="Times New Roman"/>
+          <w:b w:val="0"/>
+          <w:i w:val="0"/>
+          <w:sz w:val="24"/>
+        </w:rPr>
+        <w:t xml:space="preserve">Zhang, J., Yu, S., Chong, D., Sicilia, A., Tomz, M. R., Manning, C. D., &amp; Shi, W. (2025). Verbalized sampling: How to mitigate mode collapse and unlock LLM diversity. arXiv:2510.01171. https://arxiv.org/abs/2510.01171</w:t>
       </w:r>
     </w:p>
     <w:sectPr>

</xml_diff>